<commit_message>
Changed doc, formatted backend code
</commit_message>
<xml_diff>
--- a/documents/templates/1_comissions(Договор поручения).docx
+++ b/documents/templates/1_comissions(Договор поручения).docx
@@ -308,7 +308,7 @@
                 <w:szCs w:val="18"/>
                 <w:lang w:val="en-US"/>
               </w:rPr>
-              <w:t>seller</w:t>
+              <w:t>buyer</w:t>
             </w:r>
             <w:proofErr w:type="gramEnd"/>
             <w:r>
@@ -366,7 +366,7 @@
                 <w:szCs w:val="18"/>
                 <w:lang w:val="en-US"/>
               </w:rPr>
-              <w:t>seller</w:t>
+              <w:t>buyer</w:t>
             </w:r>
             <w:r>
               <w:rPr>
@@ -423,7 +423,7 @@
                 <w:szCs w:val="18"/>
                 <w:lang w:val="en-US"/>
               </w:rPr>
-              <w:t>seller</w:t>
+              <w:t>buyer</w:t>
             </w:r>
             <w:r>
               <w:rPr>
@@ -3911,6 +3911,9 @@
               <w:t>.</w:t>
             </w:r>
             <w:r>
+              <w:rPr>
+                <w:rFonts w:ascii="Times New Roman" w:hAnsi="Times New Roman" w:cs="Times New Roman"/>
+              </w:rPr>
               <w:t xml:space="preserve"> </w:t>
             </w:r>
             <w:r>
@@ -4092,6 +4095,9 @@
           <w:p>
             <w:pPr>
               <w:pStyle w:val="a3"/>
+              <w:rPr>
+                <w:rFonts w:ascii="Times New Roman" w:hAnsi="Times New Roman" w:cs="Times New Roman"/>
+              </w:rPr>
             </w:pPr>
             <w:r>
               <w:rPr>
@@ -5043,25 +5049,7 @@
                 <w:szCs w:val="18"/>
                 <w:lang w:val="en-US"/>
               </w:rPr>
-              <w:t xml:space="preserve"> == "</w:t>
-            </w:r>
-            <w:r>
-              <w:rPr>
-                <w:rFonts w:ascii="Times New Roman" w:hAnsi="Times New Roman" w:cs="Times New Roman"/>
-                <w:sz w:val="18"/>
-                <w:szCs w:val="18"/>
-                <w:lang w:val="en-US"/>
-              </w:rPr>
-              <w:t>person</w:t>
-            </w:r>
-            <w:r>
-              <w:rPr>
-                <w:rFonts w:ascii="Times New Roman" w:hAnsi="Times New Roman" w:cs="Times New Roman"/>
-                <w:sz w:val="18"/>
-                <w:szCs w:val="18"/>
-                <w:lang w:val="en-US"/>
-              </w:rPr>
-              <w:t xml:space="preserve">" </w:t>
+              <w:t xml:space="preserve"> == "person" </w:t>
             </w:r>
             <w:proofErr w:type="gramStart"/>
             <w:r>
@@ -5505,16 +5493,7 @@
                 <w:szCs w:val="18"/>
                 <w:lang w:val="en-US"/>
               </w:rPr>
-              <w:t xml:space="preserve">. </w:t>
-            </w:r>
-            <w:r>
-              <w:rPr>
-                <w:rFonts w:ascii="Times New Roman" w:hAnsi="Times New Roman" w:cs="Times New Roman"/>
-                <w:sz w:val="18"/>
-                <w:szCs w:val="18"/>
-                <w:lang w:val="en-US"/>
-              </w:rPr>
-              <w:t>{{</w:t>
+              <w:t>. {{</w:t>
             </w:r>
             <w:proofErr w:type="spellStart"/>
             <w:r>
@@ -6225,6 +6204,7 @@
             </w:r>
             <w:r>
               <w:rPr>
+                <w:rFonts w:ascii="Times New Roman" w:hAnsi="Times New Roman" w:cs="Times New Roman"/>
                 <w:bCs/>
                 <w:sz w:val="18"/>
                 <w:szCs w:val="18"/>
@@ -6235,6 +6215,7 @@
             <w:proofErr w:type="spellStart"/>
             <w:r>
               <w:rPr>
+                <w:rFonts w:ascii="Times New Roman" w:hAnsi="Times New Roman" w:cs="Times New Roman"/>
                 <w:bCs/>
                 <w:sz w:val="18"/>
                 <w:szCs w:val="18"/>
@@ -6245,6 +6226,7 @@
             <w:proofErr w:type="spellEnd"/>
             <w:r>
               <w:rPr>
+                <w:rFonts w:ascii="Times New Roman" w:hAnsi="Times New Roman" w:cs="Times New Roman"/>
                 <w:bCs/>
                 <w:sz w:val="18"/>
                 <w:szCs w:val="18"/>
@@ -6671,6 +6653,7 @@
       </w:r>
       <w:r>
         <w:rPr>
+          <w:rFonts w:ascii="Times New Roman" w:hAnsi="Times New Roman" w:cs="Times New Roman"/>
           <w:sz w:val="18"/>
           <w:szCs w:val="18"/>
         </w:rPr>
@@ -6679,6 +6662,7 @@
       <w:proofErr w:type="gramEnd"/>
       <w:r>
         <w:rPr>
+          <w:rFonts w:ascii="Times New Roman" w:hAnsi="Times New Roman" w:cs="Times New Roman"/>
           <w:sz w:val="18"/>
           <w:szCs w:val="18"/>
         </w:rPr>
@@ -6686,6 +6670,7 @@
       </w:r>
       <w:r>
         <w:rPr>
+          <w:rFonts w:ascii="Times New Roman" w:hAnsi="Times New Roman" w:cs="Times New Roman"/>
           <w:sz w:val="18"/>
           <w:szCs w:val="18"/>
           <w:lang w:val="en-US"/>
@@ -6694,6 +6679,7 @@
       </w:r>
       <w:r>
         <w:rPr>
+          <w:rFonts w:ascii="Times New Roman" w:hAnsi="Times New Roman" w:cs="Times New Roman"/>
           <w:sz w:val="18"/>
           <w:szCs w:val="18"/>
         </w:rPr>
@@ -6701,6 +6687,7 @@
       </w:r>
       <w:r>
         <w:rPr>
+          <w:rFonts w:ascii="Times New Roman" w:hAnsi="Times New Roman" w:cs="Times New Roman"/>
           <w:sz w:val="18"/>
           <w:szCs w:val="18"/>
           <w:lang w:val="en-US"/>
@@ -6709,6 +6696,7 @@
       </w:r>
       <w:r>
         <w:rPr>
+          <w:rFonts w:ascii="Times New Roman" w:hAnsi="Times New Roman" w:cs="Times New Roman"/>
           <w:sz w:val="18"/>
           <w:szCs w:val="18"/>
         </w:rPr>
@@ -6757,16 +6745,187 @@
         </w:rPr>
         <w:t xml:space="preserve">Гражданин </w:t>
       </w:r>
-      <w:r>
-        <w:rPr>
-          <w:rFonts w:ascii="Times New Roman" w:eastAsia="Times New Roman" w:hAnsi="Times New Roman" w:cs="Times New Roman"/>
+      <w:proofErr w:type="gramStart"/>
+      <w:r>
+        <w:rPr>
+          <w:rFonts w:ascii="Times New Roman" w:hAnsi="Times New Roman" w:cs="Times New Roman"/>
           <w:b/>
-          <w:bCs/>
-          <w:sz w:val="18"/>
-          <w:szCs w:val="18"/>
-          <w:lang w:eastAsia="ru-RU"/>
-        </w:rPr>
-        <w:t>ФАМИЛИЯ ИМЯ ОТЧЕСТВО</w:t>
+          <w:sz w:val="18"/>
+          <w:szCs w:val="18"/>
+        </w:rPr>
+        <w:t xml:space="preserve">{{ </w:t>
+      </w:r>
+      <w:r>
+        <w:rPr>
+          <w:rFonts w:ascii="Times New Roman" w:hAnsi="Times New Roman" w:cs="Times New Roman"/>
+          <w:b/>
+          <w:sz w:val="18"/>
+          <w:szCs w:val="18"/>
+          <w:lang w:val="en-US"/>
+        </w:rPr>
+        <w:t>buyer</w:t>
+      </w:r>
+      <w:proofErr w:type="gramEnd"/>
+      <w:r>
+        <w:rPr>
+          <w:rFonts w:ascii="Times New Roman" w:hAnsi="Times New Roman" w:cs="Times New Roman"/>
+          <w:b/>
+          <w:sz w:val="18"/>
+          <w:szCs w:val="18"/>
+        </w:rPr>
+        <w:t>_</w:t>
+      </w:r>
+      <w:r>
+        <w:rPr>
+          <w:rFonts w:ascii="Times New Roman" w:hAnsi="Times New Roman" w:cs="Times New Roman"/>
+          <w:b/>
+          <w:sz w:val="18"/>
+          <w:szCs w:val="18"/>
+          <w:lang w:val="en-US"/>
+        </w:rPr>
+        <w:t>last</w:t>
+      </w:r>
+      <w:r>
+        <w:rPr>
+          <w:rFonts w:ascii="Times New Roman" w:hAnsi="Times New Roman" w:cs="Times New Roman"/>
+          <w:b/>
+          <w:sz w:val="18"/>
+          <w:szCs w:val="18"/>
+        </w:rPr>
+        <w:t>_</w:t>
+      </w:r>
+      <w:r>
+        <w:rPr>
+          <w:rFonts w:ascii="Times New Roman" w:hAnsi="Times New Roman" w:cs="Times New Roman"/>
+          <w:b/>
+          <w:sz w:val="18"/>
+          <w:szCs w:val="18"/>
+          <w:lang w:val="en-US"/>
+        </w:rPr>
+        <w:t>name</w:t>
+      </w:r>
+      <w:r>
+        <w:rPr>
+          <w:rFonts w:ascii="Times New Roman" w:hAnsi="Times New Roman" w:cs="Times New Roman"/>
+          <w:b/>
+          <w:sz w:val="18"/>
+          <w:szCs w:val="18"/>
+        </w:rPr>
+        <w:t xml:space="preserve"> }} {{ </w:t>
+      </w:r>
+      <w:r>
+        <w:rPr>
+          <w:rFonts w:ascii="Times New Roman" w:hAnsi="Times New Roman" w:cs="Times New Roman"/>
+          <w:b/>
+          <w:sz w:val="18"/>
+          <w:szCs w:val="18"/>
+          <w:lang w:val="en-US"/>
+        </w:rPr>
+        <w:t>buyer</w:t>
+      </w:r>
+      <w:r>
+        <w:rPr>
+          <w:rFonts w:ascii="Times New Roman" w:hAnsi="Times New Roman" w:cs="Times New Roman"/>
+          <w:b/>
+          <w:sz w:val="18"/>
+          <w:szCs w:val="18"/>
+        </w:rPr>
+        <w:t>_</w:t>
+      </w:r>
+      <w:r>
+        <w:rPr>
+          <w:rFonts w:ascii="Times New Roman" w:hAnsi="Times New Roman" w:cs="Times New Roman"/>
+          <w:b/>
+          <w:sz w:val="18"/>
+          <w:szCs w:val="18"/>
+          <w:lang w:val="en-US"/>
+        </w:rPr>
+        <w:t>first</w:t>
+      </w:r>
+      <w:r>
+        <w:rPr>
+          <w:rFonts w:ascii="Times New Roman" w:hAnsi="Times New Roman" w:cs="Times New Roman"/>
+          <w:b/>
+          <w:sz w:val="18"/>
+          <w:szCs w:val="18"/>
+        </w:rPr>
+        <w:t>_</w:t>
+      </w:r>
+      <w:r>
+        <w:rPr>
+          <w:rFonts w:ascii="Times New Roman" w:hAnsi="Times New Roman" w:cs="Times New Roman"/>
+          <w:b/>
+          <w:sz w:val="18"/>
+          <w:szCs w:val="18"/>
+          <w:lang w:val="en-US"/>
+        </w:rPr>
+        <w:t>name</w:t>
+      </w:r>
+      <w:r>
+        <w:rPr>
+          <w:rFonts w:ascii="Times New Roman" w:hAnsi="Times New Roman" w:cs="Times New Roman"/>
+          <w:b/>
+          <w:sz w:val="18"/>
+          <w:szCs w:val="18"/>
+        </w:rPr>
+        <w:t xml:space="preserve"> }} {{ </w:t>
+      </w:r>
+      <w:r>
+        <w:rPr>
+          <w:rFonts w:ascii="Times New Roman" w:hAnsi="Times New Roman" w:cs="Times New Roman"/>
+          <w:b/>
+          <w:sz w:val="18"/>
+          <w:szCs w:val="18"/>
+          <w:lang w:val="en-US"/>
+        </w:rPr>
+        <w:t>buyer</w:t>
+      </w:r>
+      <w:r>
+        <w:rPr>
+          <w:rFonts w:ascii="Times New Roman" w:hAnsi="Times New Roman" w:cs="Times New Roman"/>
+          <w:b/>
+          <w:sz w:val="18"/>
+          <w:szCs w:val="18"/>
+        </w:rPr>
+        <w:t>_</w:t>
+      </w:r>
+      <w:r>
+        <w:rPr>
+          <w:rFonts w:ascii="Times New Roman" w:hAnsi="Times New Roman" w:cs="Times New Roman"/>
+          <w:b/>
+          <w:sz w:val="18"/>
+          <w:szCs w:val="18"/>
+          <w:lang w:val="en-US"/>
+        </w:rPr>
+        <w:t>middle</w:t>
+      </w:r>
+      <w:r>
+        <w:rPr>
+          <w:rFonts w:ascii="Times New Roman" w:hAnsi="Times New Roman" w:cs="Times New Roman"/>
+          <w:b/>
+          <w:sz w:val="18"/>
+          <w:szCs w:val="18"/>
+        </w:rPr>
+        <w:t>_</w:t>
+      </w:r>
+      <w:r>
+        <w:rPr>
+          <w:rFonts w:ascii="Times New Roman" w:hAnsi="Times New Roman" w:cs="Times New Roman"/>
+          <w:b/>
+          <w:sz w:val="18"/>
+          <w:szCs w:val="18"/>
+          <w:lang w:val="en-US"/>
+        </w:rPr>
+        <w:t>name</w:t>
+      </w:r>
+      <w:r>
+        <w:rPr>
+          <w:rFonts w:ascii="Times New Roman" w:hAnsi="Times New Roman" w:cs="Times New Roman"/>
+          <w:b/>
+          <w:sz w:val="18"/>
+          <w:szCs w:val="18"/>
+        </w:rPr>
+        <w:t xml:space="preserve"> }}</w:t>
       </w:r>
       <w:r>
         <w:rPr>
@@ -9324,7 +9483,7 @@
       </w:pPr>
       <w:r>
         <w:rPr>
-          <w:rFonts w:ascii="Times New Roman" w:hAnsi="Times New Roman"/>
+          <w:rFonts w:ascii="Times New Roman" w:hAnsi="Times New Roman" w:cs="Times New Roman"/>
           <w:sz w:val="18"/>
           <w:szCs w:val="18"/>
         </w:rPr>
@@ -9332,7 +9491,7 @@
       </w:r>
       <w:r>
         <w:rPr>
-          <w:rFonts w:ascii="Times New Roman" w:hAnsi="Times New Roman"/>
+          <w:rFonts w:ascii="Times New Roman" w:hAnsi="Times New Roman" w:cs="Times New Roman"/>
           <w:sz w:val="18"/>
           <w:szCs w:val="18"/>
         </w:rPr>
@@ -9340,7 +9499,7 @@
       </w:r>
       <w:r>
         <w:rPr>
-          <w:rFonts w:ascii="Times New Roman" w:hAnsi="Times New Roman"/>
+          <w:rFonts w:ascii="Times New Roman" w:hAnsi="Times New Roman" w:cs="Times New Roman"/>
           <w:sz w:val="18"/>
           <w:szCs w:val="18"/>
         </w:rPr>
@@ -10187,25 +10346,7 @@
                 <w:szCs w:val="18"/>
                 <w:lang w:val="en-US"/>
               </w:rPr>
-              <w:t xml:space="preserve"> == "</w:t>
-            </w:r>
-            <w:r>
-              <w:rPr>
-                <w:rFonts w:ascii="Times New Roman" w:hAnsi="Times New Roman" w:cs="Times New Roman"/>
-                <w:sz w:val="18"/>
-                <w:szCs w:val="18"/>
-                <w:lang w:val="en-US"/>
-              </w:rPr>
-              <w:t>person</w:t>
-            </w:r>
-            <w:r>
-              <w:rPr>
-                <w:rFonts w:ascii="Times New Roman" w:hAnsi="Times New Roman" w:cs="Times New Roman"/>
-                <w:sz w:val="18"/>
-                <w:szCs w:val="18"/>
-                <w:lang w:val="en-US"/>
-              </w:rPr>
-              <w:t xml:space="preserve">" </w:t>
+              <w:t xml:space="preserve"> == "person" </w:t>
             </w:r>
             <w:proofErr w:type="gramStart"/>
             <w:r>
@@ -11528,6 +11669,7 @@
             </w:r>
             <w:r>
               <w:rPr>
+                <w:rFonts w:ascii="Times New Roman" w:hAnsi="Times New Roman" w:cs="Times New Roman"/>
                 <w:bCs/>
                 <w:sz w:val="18"/>
                 <w:szCs w:val="18"/>
@@ -11538,6 +11680,7 @@
             <w:proofErr w:type="spellStart"/>
             <w:r>
               <w:rPr>
+                <w:rFonts w:ascii="Times New Roman" w:hAnsi="Times New Roman" w:cs="Times New Roman"/>
                 <w:bCs/>
                 <w:sz w:val="18"/>
                 <w:szCs w:val="18"/>
@@ -11548,6 +11691,7 @@
             <w:proofErr w:type="spellEnd"/>
             <w:r>
               <w:rPr>
+                <w:rFonts w:ascii="Times New Roman" w:hAnsi="Times New Roman" w:cs="Times New Roman"/>
                 <w:bCs/>
                 <w:sz w:val="18"/>
                 <w:szCs w:val="18"/>
@@ -11713,27 +11857,7 @@
           <w:szCs w:val="18"/>
           <w:lang w:val="en-US"/>
         </w:rPr>
-        <w:t>doc</w:t>
-      </w:r>
-      <w:r>
-        <w:rPr>
-          <w:rFonts w:ascii="Times New Roman" w:hAnsi="Times New Roman" w:cs="Times New Roman"/>
-          <w:i/>
-          <w:sz w:val="18"/>
-          <w:szCs w:val="18"/>
-          <w:lang w:val="en-US"/>
-        </w:rPr>
-        <w:t>_</w:t>
-      </w:r>
-      <w:r>
-        <w:rPr>
-          <w:rFonts w:ascii="Times New Roman" w:hAnsi="Times New Roman" w:cs="Times New Roman"/>
-          <w:i/>
-          <w:sz w:val="18"/>
-          <w:szCs w:val="18"/>
-          <w:lang w:val="en-US"/>
-        </w:rPr>
-        <w:t>id</w:t>
+        <w:t>doc_id</w:t>
       </w:r>
       <w:proofErr w:type="spellEnd"/>
       <w:r>
@@ -11795,27 +11919,7 @@
           <w:szCs w:val="18"/>
           <w:lang w:val="en-US"/>
         </w:rPr>
-        <w:t>doc</w:t>
-      </w:r>
-      <w:r>
-        <w:rPr>
-          <w:rFonts w:ascii="Times New Roman" w:hAnsi="Times New Roman" w:cs="Times New Roman"/>
-          <w:i/>
-          <w:sz w:val="18"/>
-          <w:szCs w:val="18"/>
-          <w:lang w:val="en-US"/>
-        </w:rPr>
-        <w:t>_</w:t>
-      </w:r>
-      <w:r>
-        <w:rPr>
-          <w:rFonts w:ascii="Times New Roman" w:hAnsi="Times New Roman" w:cs="Times New Roman"/>
-          <w:i/>
-          <w:sz w:val="18"/>
-          <w:szCs w:val="18"/>
-          <w:lang w:val="en-US"/>
-        </w:rPr>
-        <w:t>date</w:t>
+        <w:t>doc_date</w:t>
       </w:r>
       <w:proofErr w:type="spellEnd"/>
       <w:r>
@@ -12005,6 +12109,7 @@
       </w:r>
       <w:r>
         <w:rPr>
+          <w:rFonts w:ascii="Times New Roman" w:hAnsi="Times New Roman" w:cs="Times New Roman"/>
           <w:sz w:val="18"/>
           <w:szCs w:val="18"/>
         </w:rPr>
@@ -12013,6 +12118,7 @@
       <w:proofErr w:type="gramEnd"/>
       <w:r>
         <w:rPr>
+          <w:rFonts w:ascii="Times New Roman" w:hAnsi="Times New Roman" w:cs="Times New Roman"/>
           <w:sz w:val="18"/>
           <w:szCs w:val="18"/>
         </w:rPr>
@@ -12020,6 +12126,7 @@
       </w:r>
       <w:r>
         <w:rPr>
+          <w:rFonts w:ascii="Times New Roman" w:hAnsi="Times New Roman" w:cs="Times New Roman"/>
           <w:sz w:val="18"/>
           <w:szCs w:val="18"/>
           <w:lang w:val="en-US"/>
@@ -12028,6 +12135,7 @@
       </w:r>
       <w:r>
         <w:rPr>
+          <w:rFonts w:ascii="Times New Roman" w:hAnsi="Times New Roman" w:cs="Times New Roman"/>
           <w:sz w:val="18"/>
           <w:szCs w:val="18"/>
         </w:rPr>
@@ -12035,6 +12143,7 @@
       </w:r>
       <w:r>
         <w:rPr>
+          <w:rFonts w:ascii="Times New Roman" w:hAnsi="Times New Roman" w:cs="Times New Roman"/>
           <w:sz w:val="18"/>
           <w:szCs w:val="18"/>
           <w:lang w:val="en-US"/>
@@ -12043,6 +12152,7 @@
       </w:r>
       <w:r>
         <w:rPr>
+          <w:rFonts w:ascii="Times New Roman" w:hAnsi="Times New Roman" w:cs="Times New Roman"/>
           <w:sz w:val="18"/>
           <w:szCs w:val="18"/>
         </w:rPr>
@@ -12076,15 +12186,7 @@
           <w:sz w:val="18"/>
           <w:szCs w:val="18"/>
         </w:rPr>
-        <w:t xml:space="preserve">    </w:t>
-      </w:r>
-      <w:r>
-        <w:rPr>
-          <w:rFonts w:ascii="Times New Roman" w:hAnsi="Times New Roman" w:cs="Times New Roman"/>
-          <w:sz w:val="18"/>
-          <w:szCs w:val="18"/>
-        </w:rPr>
-        <w:t xml:space="preserve">Я, </w:t>
+        <w:t xml:space="preserve">    Я, </w:t>
       </w:r>
       <w:r>
         <w:rPr>
@@ -16123,7 +16225,13 @@
         </w:rPr>
       </w:pPr>
     </w:p>
-    <w:p/>
+    <w:p>
+      <w:pPr>
+        <w:rPr>
+          <w:rFonts w:ascii="Times New Roman" w:hAnsi="Times New Roman" w:cs="Times New Roman"/>
+        </w:rPr>
+      </w:pPr>
+    </w:p>
     <w:sectPr>
       <w:pgSz w:w="11906" w:h="16838"/>
       <w:pgMar w:top="720" w:right="720" w:bottom="720" w:left="720" w:header="708" w:footer="708" w:gutter="0"/>

</xml_diff>

<commit_message>
Huge refactor and added test version of billings
</commit_message>
<xml_diff>
--- a/documents/templates/1_comissions(Договор поручения).docx
+++ b/documents/templates/1_comissions(Договор поручения).docx
@@ -2351,7 +2351,6 @@
                       <w:rFonts w:ascii="Times New Roman" w:hAnsi="Times New Roman" w:cs="Times New Roman"/>
                       <w:sz w:val="18"/>
                       <w:szCs w:val="18"/>
-                      <w:lang w:val="en-US"/>
                     </w:rPr>
                   </w:pPr>
                   <w:r>
@@ -2359,9 +2358,8 @@
                       <w:rFonts w:ascii="Times New Roman" w:hAnsi="Times New Roman" w:cs="Times New Roman"/>
                       <w:sz w:val="18"/>
                       <w:szCs w:val="18"/>
-                      <w:lang w:val="en-US"/>
                     </w:rPr>
-                    <w:t>{{</w:t>
+                    <w:t xml:space="preserve">{% </w:t>
                   </w:r>
                   <w:proofErr w:type="spellStart"/>
                   <w:r>
@@ -2369,29 +2367,8 @@
                       <w:rFonts w:ascii="Times New Roman" w:hAnsi="Times New Roman" w:cs="Times New Roman"/>
                       <w:sz w:val="18"/>
                       <w:szCs w:val="18"/>
-                      <w:lang w:val="en-US"/>
                     </w:rPr>
-                    <w:t>pts</w:t>
-                  </w:r>
-                  <w:r>
-                    <w:rPr>
-                      <w:rFonts w:ascii="Times New Roman" w:hAnsi="Times New Roman" w:cs="Times New Roman"/>
-                      <w:b/>
-                      <w:bCs/>
-                      <w:sz w:val="18"/>
-                      <w:szCs w:val="18"/>
-                      <w:lang w:val="en-US"/>
-                    </w:rPr>
-                    <w:t>_</w:t>
-                  </w:r>
-                  <w:r>
-                    <w:rPr>
-                      <w:rFonts w:ascii="Times New Roman" w:hAnsi="Times New Roman" w:cs="Times New Roman"/>
-                      <w:sz w:val="18"/>
-                      <w:szCs w:val="18"/>
-                      <w:lang w:val="en-US"/>
-                    </w:rPr>
-                    <w:t>id</w:t>
+                    <w:t>if</w:t>
                   </w:r>
                   <w:proofErr w:type="spellEnd"/>
                   <w:r>
@@ -2399,26 +2376,8 @@
                       <w:rFonts w:ascii="Times New Roman" w:hAnsi="Times New Roman" w:cs="Times New Roman"/>
                       <w:sz w:val="18"/>
                       <w:szCs w:val="18"/>
-                      <w:lang w:val="en-US"/>
                     </w:rPr>
-                    <w:t xml:space="preserve">}} </w:t>
-                  </w:r>
-                  <w:r>
-                    <w:rPr>
-                      <w:rFonts w:ascii="Times New Roman" w:hAnsi="Times New Roman" w:cs="Times New Roman"/>
-                      <w:sz w:val="18"/>
-                      <w:szCs w:val="18"/>
-                    </w:rPr>
-                    <w:t>от</w:t>
-                  </w:r>
-                  <w:r>
-                    <w:rPr>
-                      <w:rFonts w:ascii="Times New Roman" w:hAnsi="Times New Roman" w:cs="Times New Roman"/>
-                      <w:sz w:val="18"/>
-                      <w:szCs w:val="18"/>
-                      <w:lang w:val="en-US"/>
-                    </w:rPr>
-                    <w:t xml:space="preserve"> {{</w:t>
+                    <w:t xml:space="preserve"> </w:t>
                   </w:r>
                   <w:proofErr w:type="spellStart"/>
                   <w:r>
@@ -2426,7 +2385,96 @@
                       <w:rFonts w:ascii="Times New Roman" w:hAnsi="Times New Roman" w:cs="Times New Roman"/>
                       <w:sz w:val="18"/>
                       <w:szCs w:val="18"/>
-                      <w:lang w:val="en-US"/>
+                    </w:rPr>
+                    <w:t>pts_id</w:t>
+                  </w:r>
+                  <w:proofErr w:type="spellEnd"/>
+                  <w:r>
+                    <w:rPr>
+                      <w:rFonts w:ascii="Times New Roman" w:hAnsi="Times New Roman" w:cs="Times New Roman"/>
+                      <w:sz w:val="18"/>
+                      <w:szCs w:val="18"/>
+                    </w:rPr>
+                    <w:t xml:space="preserve"> </w:t>
+                  </w:r>
+                  <w:proofErr w:type="gramStart"/>
+                  <w:r>
+                    <w:rPr>
+                      <w:rFonts w:ascii="Times New Roman" w:hAnsi="Times New Roman" w:cs="Times New Roman"/>
+                      <w:sz w:val="18"/>
+                      <w:szCs w:val="18"/>
+                    </w:rPr>
+                    <w:t>%}{</w:t>
+                  </w:r>
+                  <w:proofErr w:type="gramEnd"/>
+                  <w:r>
+                    <w:rPr>
+                      <w:rFonts w:ascii="Times New Roman" w:hAnsi="Times New Roman" w:cs="Times New Roman"/>
+                      <w:sz w:val="18"/>
+                      <w:szCs w:val="18"/>
+                    </w:rPr>
+                    <w:t xml:space="preserve">{ </w:t>
+                  </w:r>
+                  <w:proofErr w:type="spellStart"/>
+                  <w:r>
+                    <w:rPr>
+                      <w:rFonts w:ascii="Times New Roman" w:hAnsi="Times New Roman" w:cs="Times New Roman"/>
+                      <w:sz w:val="18"/>
+                      <w:szCs w:val="18"/>
+                    </w:rPr>
+                    <w:t>pts_id</w:t>
+                  </w:r>
+                  <w:proofErr w:type="spellEnd"/>
+                  <w:r>
+                    <w:rPr>
+                      <w:rFonts w:ascii="Times New Roman" w:hAnsi="Times New Roman" w:cs="Times New Roman"/>
+                      <w:sz w:val="18"/>
+                      <w:szCs w:val="18"/>
+                    </w:rPr>
+                    <w:t xml:space="preserve"> }}{% </w:t>
+                  </w:r>
+                  <w:proofErr w:type="spellStart"/>
+                  <w:r>
+                    <w:rPr>
+                      <w:rFonts w:ascii="Times New Roman" w:hAnsi="Times New Roman" w:cs="Times New Roman"/>
+                      <w:sz w:val="18"/>
+                      <w:szCs w:val="18"/>
+                    </w:rPr>
+                    <w:t>endif</w:t>
+                  </w:r>
+                  <w:proofErr w:type="spellEnd"/>
+                  <w:r>
+                    <w:rPr>
+                      <w:rFonts w:ascii="Times New Roman" w:hAnsi="Times New Roman" w:cs="Times New Roman"/>
+                      <w:sz w:val="18"/>
+                      <w:szCs w:val="18"/>
+                    </w:rPr>
+                    <w:t xml:space="preserve"> %}{% </w:t>
+                  </w:r>
+                  <w:proofErr w:type="spellStart"/>
+                  <w:r>
+                    <w:rPr>
+                      <w:rFonts w:ascii="Times New Roman" w:hAnsi="Times New Roman" w:cs="Times New Roman"/>
+                      <w:sz w:val="18"/>
+                      <w:szCs w:val="18"/>
+                    </w:rPr>
+                    <w:t>if</w:t>
+                  </w:r>
+                  <w:proofErr w:type="spellEnd"/>
+                  <w:r>
+                    <w:rPr>
+                      <w:rFonts w:ascii="Times New Roman" w:hAnsi="Times New Roman" w:cs="Times New Roman"/>
+                      <w:sz w:val="18"/>
+                      <w:szCs w:val="18"/>
+                    </w:rPr>
+                    <w:t xml:space="preserve"> </w:t>
+                  </w:r>
+                  <w:proofErr w:type="spellStart"/>
+                  <w:r>
+                    <w:rPr>
+                      <w:rFonts w:ascii="Times New Roman" w:hAnsi="Times New Roman" w:cs="Times New Roman"/>
+                      <w:sz w:val="18"/>
+                      <w:szCs w:val="18"/>
                     </w:rPr>
                     <w:t>pts_date</w:t>
                   </w:r>
@@ -2436,9 +2484,152 @@
                       <w:rFonts w:ascii="Times New Roman" w:hAnsi="Times New Roman" w:cs="Times New Roman"/>
                       <w:sz w:val="18"/>
                       <w:szCs w:val="18"/>
-                      <w:lang w:val="en-US"/>
                     </w:rPr>
-                    <w:t>}}</w:t>
+                    <w:t xml:space="preserve"> </w:t>
+                  </w:r>
+                  <w:proofErr w:type="spellStart"/>
+                  <w:r>
+                    <w:rPr>
+                      <w:rFonts w:ascii="Times New Roman" w:hAnsi="Times New Roman" w:cs="Times New Roman"/>
+                      <w:sz w:val="18"/>
+                      <w:szCs w:val="18"/>
+                    </w:rPr>
+                    <w:t>and</w:t>
+                  </w:r>
+                  <w:proofErr w:type="spellEnd"/>
+                  <w:r>
+                    <w:rPr>
+                      <w:rFonts w:ascii="Times New Roman" w:hAnsi="Times New Roman" w:cs="Times New Roman"/>
+                      <w:sz w:val="18"/>
+                      <w:szCs w:val="18"/>
+                    </w:rPr>
+                    <w:t xml:space="preserve"> </w:t>
+                  </w:r>
+                  <w:proofErr w:type="spellStart"/>
+                  <w:r>
+                    <w:rPr>
+                      <w:rFonts w:ascii="Times New Roman" w:hAnsi="Times New Roman" w:cs="Times New Roman"/>
+                      <w:sz w:val="18"/>
+                      <w:szCs w:val="18"/>
+                    </w:rPr>
+                    <w:t>pts_id</w:t>
+                  </w:r>
+                  <w:proofErr w:type="spellEnd"/>
+                  <w:r>
+                    <w:rPr>
+                      <w:rFonts w:ascii="Times New Roman" w:hAnsi="Times New Roman" w:cs="Times New Roman"/>
+                      <w:sz w:val="18"/>
+                      <w:szCs w:val="18"/>
+                    </w:rPr>
+                    <w:t xml:space="preserve"> %} от {{ </w:t>
+                  </w:r>
+                  <w:proofErr w:type="spellStart"/>
+                  <w:r>
+                    <w:rPr>
+                      <w:rFonts w:ascii="Times New Roman" w:hAnsi="Times New Roman" w:cs="Times New Roman"/>
+                      <w:sz w:val="18"/>
+                      <w:szCs w:val="18"/>
+                    </w:rPr>
+                    <w:t>pts_date</w:t>
+                  </w:r>
+                  <w:proofErr w:type="spellEnd"/>
+                  <w:r>
+                    <w:rPr>
+                      <w:rFonts w:ascii="Times New Roman" w:hAnsi="Times New Roman" w:cs="Times New Roman"/>
+                      <w:sz w:val="18"/>
+                      <w:szCs w:val="18"/>
+                    </w:rPr>
+                    <w:t xml:space="preserve"> }}{% </w:t>
+                  </w:r>
+                  <w:proofErr w:type="spellStart"/>
+                  <w:r>
+                    <w:rPr>
+                      <w:rFonts w:ascii="Times New Roman" w:hAnsi="Times New Roman" w:cs="Times New Roman"/>
+                      <w:sz w:val="18"/>
+                      <w:szCs w:val="18"/>
+                    </w:rPr>
+                    <w:t>endif</w:t>
+                  </w:r>
+                  <w:proofErr w:type="spellEnd"/>
+                  <w:r>
+                    <w:rPr>
+                      <w:rFonts w:ascii="Times New Roman" w:hAnsi="Times New Roman" w:cs="Times New Roman"/>
+                      <w:sz w:val="18"/>
+                      <w:szCs w:val="18"/>
+                    </w:rPr>
+                    <w:t xml:space="preserve"> %}{% </w:t>
+                  </w:r>
+                  <w:proofErr w:type="spellStart"/>
+                  <w:r>
+                    <w:rPr>
+                      <w:rFonts w:ascii="Times New Roman" w:hAnsi="Times New Roman" w:cs="Times New Roman"/>
+                      <w:sz w:val="18"/>
+                      <w:szCs w:val="18"/>
+                    </w:rPr>
+                    <w:t>if</w:t>
+                  </w:r>
+                  <w:proofErr w:type="spellEnd"/>
+                  <w:r>
+                    <w:rPr>
+                      <w:rFonts w:ascii="Times New Roman" w:hAnsi="Times New Roman" w:cs="Times New Roman"/>
+                      <w:sz w:val="18"/>
+                      <w:szCs w:val="18"/>
+                    </w:rPr>
+                    <w:t xml:space="preserve"> </w:t>
+                  </w:r>
+                  <w:proofErr w:type="spellStart"/>
+                  <w:r>
+                    <w:rPr>
+                      <w:rFonts w:ascii="Times New Roman" w:hAnsi="Times New Roman" w:cs="Times New Roman"/>
+                      <w:sz w:val="18"/>
+                      <w:szCs w:val="18"/>
+                    </w:rPr>
+                    <w:t>not</w:t>
+                  </w:r>
+                  <w:proofErr w:type="spellEnd"/>
+                  <w:r>
+                    <w:rPr>
+                      <w:rFonts w:ascii="Times New Roman" w:hAnsi="Times New Roman" w:cs="Times New Roman"/>
+                      <w:sz w:val="18"/>
+                      <w:szCs w:val="18"/>
+                    </w:rPr>
+                    <w:t xml:space="preserve"> </w:t>
+                  </w:r>
+                  <w:proofErr w:type="spellStart"/>
+                  <w:r>
+                    <w:rPr>
+                      <w:rFonts w:ascii="Times New Roman" w:hAnsi="Times New Roman" w:cs="Times New Roman"/>
+                      <w:sz w:val="18"/>
+                      <w:szCs w:val="18"/>
+                    </w:rPr>
+                    <w:t>pts_id</w:t>
+                  </w:r>
+                  <w:proofErr w:type="spellEnd"/>
+                  <w:r>
+                    <w:rPr>
+                      <w:rFonts w:ascii="Times New Roman" w:hAnsi="Times New Roman" w:cs="Times New Roman"/>
+                      <w:sz w:val="18"/>
+                      <w:szCs w:val="18"/>
+                    </w:rPr>
+                    <w:t xml:space="preserve"> %}Отсутствует{% </w:t>
+                  </w:r>
+                  <w:proofErr w:type="spellStart"/>
+                  <w:r>
+                    <w:rPr>
+                      <w:rFonts w:ascii="Times New Roman" w:hAnsi="Times New Roman" w:cs="Times New Roman"/>
+                      <w:sz w:val="18"/>
+                      <w:szCs w:val="18"/>
+                    </w:rPr>
+                    <w:t>endif</w:t>
+                  </w:r>
+                  <w:proofErr w:type="spellEnd"/>
+                  <w:r>
+                    <w:rPr>
+                      <w:rFonts w:ascii="Times New Roman" w:hAnsi="Times New Roman" w:cs="Times New Roman"/>
+                      <w:sz w:val="18"/>
+                      <w:szCs w:val="18"/>
+                    </w:rPr>
+                    <w:t xml:space="preserve"> %}</w:t>
                   </w:r>
                 </w:p>
               </w:tc>
@@ -2535,26 +2726,6 @@
                       <w:szCs w:val="18"/>
                       <w:lang w:val="en-US"/>
                     </w:rPr>
-                    <w:t xml:space="preserve"> and </w:t>
-                  </w:r>
-                  <w:proofErr w:type="spellStart"/>
-                  <w:r>
-                    <w:rPr>
-                      <w:rFonts w:ascii="Times New Roman" w:hAnsi="Times New Roman" w:cs="Times New Roman"/>
-                      <w:sz w:val="18"/>
-                      <w:szCs w:val="18"/>
-                      <w:lang w:val="en-US"/>
-                    </w:rPr>
-                    <w:t>sts_date</w:t>
-                  </w:r>
-                  <w:proofErr w:type="spellEnd"/>
-                  <w:r>
-                    <w:rPr>
-                      <w:rFonts w:ascii="Times New Roman" w:hAnsi="Times New Roman" w:cs="Times New Roman"/>
-                      <w:sz w:val="18"/>
-                      <w:szCs w:val="18"/>
-                      <w:lang w:val="en-US"/>
-                    </w:rPr>
                     <w:t xml:space="preserve"> </w:t>
                   </w:r>
                   <w:proofErr w:type="gramStart"/>
@@ -2595,7 +2766,47 @@
                       <w:szCs w:val="18"/>
                       <w:lang w:val="en-US"/>
                     </w:rPr>
-                    <w:t xml:space="preserve"> }} </w:t>
+                    <w:t xml:space="preserve"> }}{% endif %}{% if </w:t>
+                  </w:r>
+                  <w:proofErr w:type="spellStart"/>
+                  <w:r>
+                    <w:rPr>
+                      <w:rFonts w:ascii="Times New Roman" w:hAnsi="Times New Roman" w:cs="Times New Roman"/>
+                      <w:sz w:val="18"/>
+                      <w:szCs w:val="18"/>
+                      <w:lang w:val="en-US"/>
+                    </w:rPr>
+                    <w:t>sts_date</w:t>
+                  </w:r>
+                  <w:proofErr w:type="spellEnd"/>
+                  <w:r>
+                    <w:rPr>
+                      <w:rFonts w:ascii="Times New Roman" w:hAnsi="Times New Roman" w:cs="Times New Roman"/>
+                      <w:sz w:val="18"/>
+                      <w:szCs w:val="18"/>
+                      <w:lang w:val="en-US"/>
+                    </w:rPr>
+                    <w:t xml:space="preserve"> and </w:t>
+                  </w:r>
+                  <w:proofErr w:type="spellStart"/>
+                  <w:r>
+                    <w:rPr>
+                      <w:rFonts w:ascii="Times New Roman" w:hAnsi="Times New Roman" w:cs="Times New Roman"/>
+                      <w:sz w:val="18"/>
+                      <w:szCs w:val="18"/>
+                      <w:lang w:val="en-US"/>
+                    </w:rPr>
+                    <w:t>sts_id</w:t>
+                  </w:r>
+                  <w:proofErr w:type="spellEnd"/>
+                  <w:r>
+                    <w:rPr>
+                      <w:rFonts w:ascii="Times New Roman" w:hAnsi="Times New Roman" w:cs="Times New Roman"/>
+                      <w:sz w:val="18"/>
+                      <w:szCs w:val="18"/>
+                      <w:lang w:val="en-US"/>
+                    </w:rPr>
+                    <w:t xml:space="preserve"> %} </w:t>
                   </w:r>
                   <w:r>
                     <w:rPr>
@@ -2632,7 +2843,27 @@
                       <w:szCs w:val="18"/>
                       <w:lang w:val="en-US"/>
                     </w:rPr>
-                    <w:t xml:space="preserve"> }}{% else %}</w:t>
+                    <w:t xml:space="preserve"> }}{% endif %}{% if not </w:t>
+                  </w:r>
+                  <w:proofErr w:type="spellStart"/>
+                  <w:r>
+                    <w:rPr>
+                      <w:rFonts w:ascii="Times New Roman" w:hAnsi="Times New Roman" w:cs="Times New Roman"/>
+                      <w:sz w:val="18"/>
+                      <w:szCs w:val="18"/>
+                      <w:lang w:val="en-US"/>
+                    </w:rPr>
+                    <w:t>sts_id</w:t>
+                  </w:r>
+                  <w:proofErr w:type="spellEnd"/>
+                  <w:r>
+                    <w:rPr>
+                      <w:rFonts w:ascii="Times New Roman" w:hAnsi="Times New Roman" w:cs="Times New Roman"/>
+                      <w:sz w:val="18"/>
+                      <w:szCs w:val="18"/>
+                      <w:lang w:val="en-US"/>
+                    </w:rPr>
+                    <w:t xml:space="preserve"> %}</w:t>
                   </w:r>
                   <w:r>
                     <w:rPr>
@@ -4137,6 +4368,7 @@
                 <w:szCs w:val="18"/>
                 <w:lang w:eastAsia="ru-RU"/>
               </w:rPr>
+              <w:lastRenderedPageBreak/>
               <w:t xml:space="preserve">4. Расчеты Сторон </w:t>
             </w:r>
           </w:p>
@@ -4188,7 +4420,6 @@
                 <w:szCs w:val="18"/>
                 <w:lang w:eastAsia="ru-RU"/>
               </w:rPr>
-              <w:lastRenderedPageBreak/>
               <w:t xml:space="preserve">4.1. Поверенный обязуется в течение 2 (двух) банковских дней со дня постановки покупателем ТС на учет в ГИБДД, но не ранее 10 (десяти) банковских дней с даты получения Поверенным от покупателя денежных средств в оплату ТС и подписания между Поверенным и покупателем Акта приема-передачи ТС перечислить Доверителю денежные средства в размере цены реализации ТС, указанной в п. 2.1.2. Договора за вычетом причитающегося Поверенному вознаграждения и расходов, связанных с выполнением поручения. </w:t>
             </w:r>
             <w:r>
@@ -9817,7 +10048,6 @@
                 <w:rFonts w:ascii="Times New Roman" w:hAnsi="Times New Roman" w:cs="Times New Roman"/>
                 <w:sz w:val="18"/>
                 <w:szCs w:val="18"/>
-                <w:lang w:val="en-US"/>
               </w:rPr>
             </w:pPr>
             <w:r>
@@ -9825,9 +10055,8 @@
                 <w:rFonts w:ascii="Times New Roman" w:hAnsi="Times New Roman" w:cs="Times New Roman"/>
                 <w:sz w:val="18"/>
                 <w:szCs w:val="18"/>
-                <w:lang w:val="en-US"/>
-              </w:rPr>
-              <w:t>{{</w:t>
+              </w:rPr>
+              <w:t xml:space="preserve">{% </w:t>
             </w:r>
             <w:proofErr w:type="spellStart"/>
             <w:r>
@@ -9835,29 +10064,8 @@
                 <w:rFonts w:ascii="Times New Roman" w:hAnsi="Times New Roman" w:cs="Times New Roman"/>
                 <w:sz w:val="18"/>
                 <w:szCs w:val="18"/>
-                <w:lang w:val="en-US"/>
-              </w:rPr>
-              <w:t>pts</w:t>
-            </w:r>
-            <w:r>
-              <w:rPr>
-                <w:rFonts w:ascii="Times New Roman" w:hAnsi="Times New Roman" w:cs="Times New Roman"/>
-                <w:b/>
-                <w:bCs/>
-                <w:sz w:val="18"/>
-                <w:szCs w:val="18"/>
-                <w:lang w:val="en-US"/>
-              </w:rPr>
-              <w:t>_</w:t>
-            </w:r>
-            <w:r>
-              <w:rPr>
-                <w:rFonts w:ascii="Times New Roman" w:hAnsi="Times New Roman" w:cs="Times New Roman"/>
-                <w:sz w:val="18"/>
-                <w:szCs w:val="18"/>
-                <w:lang w:val="en-US"/>
-              </w:rPr>
-              <w:t>id</w:t>
+              </w:rPr>
+              <w:t>if</w:t>
             </w:r>
             <w:proofErr w:type="spellEnd"/>
             <w:r>
@@ -9865,26 +10073,8 @@
                 <w:rFonts w:ascii="Times New Roman" w:hAnsi="Times New Roman" w:cs="Times New Roman"/>
                 <w:sz w:val="18"/>
                 <w:szCs w:val="18"/>
-                <w:lang w:val="en-US"/>
-              </w:rPr>
-              <w:t xml:space="preserve">}} </w:t>
-            </w:r>
-            <w:r>
-              <w:rPr>
-                <w:rFonts w:ascii="Times New Roman" w:hAnsi="Times New Roman" w:cs="Times New Roman"/>
-                <w:sz w:val="18"/>
-                <w:szCs w:val="18"/>
-              </w:rPr>
-              <w:t>от</w:t>
-            </w:r>
-            <w:r>
-              <w:rPr>
-                <w:rFonts w:ascii="Times New Roman" w:hAnsi="Times New Roman" w:cs="Times New Roman"/>
-                <w:sz w:val="18"/>
-                <w:szCs w:val="18"/>
-                <w:lang w:val="en-US"/>
-              </w:rPr>
-              <w:t xml:space="preserve"> {{</w:t>
+              </w:rPr>
+              <w:t xml:space="preserve"> </w:t>
             </w:r>
             <w:proofErr w:type="spellStart"/>
             <w:r>
@@ -9892,7 +10082,96 @@
                 <w:rFonts w:ascii="Times New Roman" w:hAnsi="Times New Roman" w:cs="Times New Roman"/>
                 <w:sz w:val="18"/>
                 <w:szCs w:val="18"/>
-                <w:lang w:val="en-US"/>
+              </w:rPr>
+              <w:t>pts_id</w:t>
+            </w:r>
+            <w:proofErr w:type="spellEnd"/>
+            <w:r>
+              <w:rPr>
+                <w:rFonts w:ascii="Times New Roman" w:hAnsi="Times New Roman" w:cs="Times New Roman"/>
+                <w:sz w:val="18"/>
+                <w:szCs w:val="18"/>
+              </w:rPr>
+              <w:t xml:space="preserve"> </w:t>
+            </w:r>
+            <w:proofErr w:type="gramStart"/>
+            <w:r>
+              <w:rPr>
+                <w:rFonts w:ascii="Times New Roman" w:hAnsi="Times New Roman" w:cs="Times New Roman"/>
+                <w:sz w:val="18"/>
+                <w:szCs w:val="18"/>
+              </w:rPr>
+              <w:t>%}{</w:t>
+            </w:r>
+            <w:proofErr w:type="gramEnd"/>
+            <w:r>
+              <w:rPr>
+                <w:rFonts w:ascii="Times New Roman" w:hAnsi="Times New Roman" w:cs="Times New Roman"/>
+                <w:sz w:val="18"/>
+                <w:szCs w:val="18"/>
+              </w:rPr>
+              <w:t xml:space="preserve">{ </w:t>
+            </w:r>
+            <w:proofErr w:type="spellStart"/>
+            <w:r>
+              <w:rPr>
+                <w:rFonts w:ascii="Times New Roman" w:hAnsi="Times New Roman" w:cs="Times New Roman"/>
+                <w:sz w:val="18"/>
+                <w:szCs w:val="18"/>
+              </w:rPr>
+              <w:t>pts_id</w:t>
+            </w:r>
+            <w:proofErr w:type="spellEnd"/>
+            <w:r>
+              <w:rPr>
+                <w:rFonts w:ascii="Times New Roman" w:hAnsi="Times New Roman" w:cs="Times New Roman"/>
+                <w:sz w:val="18"/>
+                <w:szCs w:val="18"/>
+              </w:rPr>
+              <w:t xml:space="preserve"> }}{% </w:t>
+            </w:r>
+            <w:proofErr w:type="spellStart"/>
+            <w:r>
+              <w:rPr>
+                <w:rFonts w:ascii="Times New Roman" w:hAnsi="Times New Roman" w:cs="Times New Roman"/>
+                <w:sz w:val="18"/>
+                <w:szCs w:val="18"/>
+              </w:rPr>
+              <w:t>endif</w:t>
+            </w:r>
+            <w:proofErr w:type="spellEnd"/>
+            <w:r>
+              <w:rPr>
+                <w:rFonts w:ascii="Times New Roman" w:hAnsi="Times New Roman" w:cs="Times New Roman"/>
+                <w:sz w:val="18"/>
+                <w:szCs w:val="18"/>
+              </w:rPr>
+              <w:t xml:space="preserve"> %}{% </w:t>
+            </w:r>
+            <w:proofErr w:type="spellStart"/>
+            <w:r>
+              <w:rPr>
+                <w:rFonts w:ascii="Times New Roman" w:hAnsi="Times New Roman" w:cs="Times New Roman"/>
+                <w:sz w:val="18"/>
+                <w:szCs w:val="18"/>
+              </w:rPr>
+              <w:t>if</w:t>
+            </w:r>
+            <w:proofErr w:type="spellEnd"/>
+            <w:r>
+              <w:rPr>
+                <w:rFonts w:ascii="Times New Roman" w:hAnsi="Times New Roman" w:cs="Times New Roman"/>
+                <w:sz w:val="18"/>
+                <w:szCs w:val="18"/>
+              </w:rPr>
+              <w:t xml:space="preserve"> </w:t>
+            </w:r>
+            <w:proofErr w:type="spellStart"/>
+            <w:r>
+              <w:rPr>
+                <w:rFonts w:ascii="Times New Roman" w:hAnsi="Times New Roman" w:cs="Times New Roman"/>
+                <w:sz w:val="18"/>
+                <w:szCs w:val="18"/>
               </w:rPr>
               <w:t>pts_date</w:t>
             </w:r>
@@ -9902,9 +10181,152 @@
                 <w:rFonts w:ascii="Times New Roman" w:hAnsi="Times New Roman" w:cs="Times New Roman"/>
                 <w:sz w:val="18"/>
                 <w:szCs w:val="18"/>
-                <w:lang w:val="en-US"/>
-              </w:rPr>
-              <w:t>}}</w:t>
+              </w:rPr>
+              <w:t xml:space="preserve"> </w:t>
+            </w:r>
+            <w:proofErr w:type="spellStart"/>
+            <w:r>
+              <w:rPr>
+                <w:rFonts w:ascii="Times New Roman" w:hAnsi="Times New Roman" w:cs="Times New Roman"/>
+                <w:sz w:val="18"/>
+                <w:szCs w:val="18"/>
+              </w:rPr>
+              <w:t>and</w:t>
+            </w:r>
+            <w:proofErr w:type="spellEnd"/>
+            <w:r>
+              <w:rPr>
+                <w:rFonts w:ascii="Times New Roman" w:hAnsi="Times New Roman" w:cs="Times New Roman"/>
+                <w:sz w:val="18"/>
+                <w:szCs w:val="18"/>
+              </w:rPr>
+              <w:t xml:space="preserve"> </w:t>
+            </w:r>
+            <w:proofErr w:type="spellStart"/>
+            <w:r>
+              <w:rPr>
+                <w:rFonts w:ascii="Times New Roman" w:hAnsi="Times New Roman" w:cs="Times New Roman"/>
+                <w:sz w:val="18"/>
+                <w:szCs w:val="18"/>
+              </w:rPr>
+              <w:t>pts_id</w:t>
+            </w:r>
+            <w:proofErr w:type="spellEnd"/>
+            <w:r>
+              <w:rPr>
+                <w:rFonts w:ascii="Times New Roman" w:hAnsi="Times New Roman" w:cs="Times New Roman"/>
+                <w:sz w:val="18"/>
+                <w:szCs w:val="18"/>
+              </w:rPr>
+              <w:t xml:space="preserve"> %} от {{ </w:t>
+            </w:r>
+            <w:proofErr w:type="spellStart"/>
+            <w:r>
+              <w:rPr>
+                <w:rFonts w:ascii="Times New Roman" w:hAnsi="Times New Roman" w:cs="Times New Roman"/>
+                <w:sz w:val="18"/>
+                <w:szCs w:val="18"/>
+              </w:rPr>
+              <w:t>pts_date</w:t>
+            </w:r>
+            <w:proofErr w:type="spellEnd"/>
+            <w:r>
+              <w:rPr>
+                <w:rFonts w:ascii="Times New Roman" w:hAnsi="Times New Roman" w:cs="Times New Roman"/>
+                <w:sz w:val="18"/>
+                <w:szCs w:val="18"/>
+              </w:rPr>
+              <w:t xml:space="preserve"> }}{% </w:t>
+            </w:r>
+            <w:proofErr w:type="spellStart"/>
+            <w:r>
+              <w:rPr>
+                <w:rFonts w:ascii="Times New Roman" w:hAnsi="Times New Roman" w:cs="Times New Roman"/>
+                <w:sz w:val="18"/>
+                <w:szCs w:val="18"/>
+              </w:rPr>
+              <w:t>endif</w:t>
+            </w:r>
+            <w:proofErr w:type="spellEnd"/>
+            <w:r>
+              <w:rPr>
+                <w:rFonts w:ascii="Times New Roman" w:hAnsi="Times New Roman" w:cs="Times New Roman"/>
+                <w:sz w:val="18"/>
+                <w:szCs w:val="18"/>
+              </w:rPr>
+              <w:t xml:space="preserve"> %}{% </w:t>
+            </w:r>
+            <w:proofErr w:type="spellStart"/>
+            <w:r>
+              <w:rPr>
+                <w:rFonts w:ascii="Times New Roman" w:hAnsi="Times New Roman" w:cs="Times New Roman"/>
+                <w:sz w:val="18"/>
+                <w:szCs w:val="18"/>
+              </w:rPr>
+              <w:t>if</w:t>
+            </w:r>
+            <w:proofErr w:type="spellEnd"/>
+            <w:r>
+              <w:rPr>
+                <w:rFonts w:ascii="Times New Roman" w:hAnsi="Times New Roman" w:cs="Times New Roman"/>
+                <w:sz w:val="18"/>
+                <w:szCs w:val="18"/>
+              </w:rPr>
+              <w:t xml:space="preserve"> </w:t>
+            </w:r>
+            <w:proofErr w:type="spellStart"/>
+            <w:r>
+              <w:rPr>
+                <w:rFonts w:ascii="Times New Roman" w:hAnsi="Times New Roman" w:cs="Times New Roman"/>
+                <w:sz w:val="18"/>
+                <w:szCs w:val="18"/>
+              </w:rPr>
+              <w:t>not</w:t>
+            </w:r>
+            <w:proofErr w:type="spellEnd"/>
+            <w:r>
+              <w:rPr>
+                <w:rFonts w:ascii="Times New Roman" w:hAnsi="Times New Roman" w:cs="Times New Roman"/>
+                <w:sz w:val="18"/>
+                <w:szCs w:val="18"/>
+              </w:rPr>
+              <w:t xml:space="preserve"> </w:t>
+            </w:r>
+            <w:proofErr w:type="spellStart"/>
+            <w:r>
+              <w:rPr>
+                <w:rFonts w:ascii="Times New Roman" w:hAnsi="Times New Roman" w:cs="Times New Roman"/>
+                <w:sz w:val="18"/>
+                <w:szCs w:val="18"/>
+              </w:rPr>
+              <w:t>pts_id</w:t>
+            </w:r>
+            <w:proofErr w:type="spellEnd"/>
+            <w:r>
+              <w:rPr>
+                <w:rFonts w:ascii="Times New Roman" w:hAnsi="Times New Roman" w:cs="Times New Roman"/>
+                <w:sz w:val="18"/>
+                <w:szCs w:val="18"/>
+              </w:rPr>
+              <w:t xml:space="preserve"> %}Отсутствует{% </w:t>
+            </w:r>
+            <w:proofErr w:type="spellStart"/>
+            <w:r>
+              <w:rPr>
+                <w:rFonts w:ascii="Times New Roman" w:hAnsi="Times New Roman" w:cs="Times New Roman"/>
+                <w:sz w:val="18"/>
+                <w:szCs w:val="18"/>
+              </w:rPr>
+              <w:t>endif</w:t>
+            </w:r>
+            <w:proofErr w:type="spellEnd"/>
+            <w:r>
+              <w:rPr>
+                <w:rFonts w:ascii="Times New Roman" w:hAnsi="Times New Roman" w:cs="Times New Roman"/>
+                <w:sz w:val="18"/>
+                <w:szCs w:val="18"/>
+              </w:rPr>
+              <w:t xml:space="preserve"> %}</w:t>
             </w:r>
           </w:p>
         </w:tc>
@@ -10001,6 +10423,66 @@
                 <w:szCs w:val="18"/>
                 <w:lang w:val="en-US"/>
               </w:rPr>
+              <w:t xml:space="preserve"> </w:t>
+            </w:r>
+            <w:proofErr w:type="gramStart"/>
+            <w:r>
+              <w:rPr>
+                <w:rFonts w:ascii="Times New Roman" w:hAnsi="Times New Roman" w:cs="Times New Roman"/>
+                <w:sz w:val="18"/>
+                <w:szCs w:val="18"/>
+                <w:lang w:val="en-US"/>
+              </w:rPr>
+              <w:t>%}{</w:t>
+            </w:r>
+            <w:proofErr w:type="gramEnd"/>
+            <w:r>
+              <w:rPr>
+                <w:rFonts w:ascii="Times New Roman" w:hAnsi="Times New Roman" w:cs="Times New Roman"/>
+                <w:sz w:val="18"/>
+                <w:szCs w:val="18"/>
+                <w:lang w:val="en-US"/>
+              </w:rPr>
+              <w:t xml:space="preserve">{ </w:t>
+            </w:r>
+            <w:proofErr w:type="spellStart"/>
+            <w:r>
+              <w:rPr>
+                <w:rFonts w:ascii="Times New Roman" w:hAnsi="Times New Roman" w:cs="Times New Roman"/>
+                <w:sz w:val="18"/>
+                <w:szCs w:val="18"/>
+                <w:lang w:val="en-US"/>
+              </w:rPr>
+              <w:t>sts_id</w:t>
+            </w:r>
+            <w:proofErr w:type="spellEnd"/>
+            <w:r>
+              <w:rPr>
+                <w:rFonts w:ascii="Times New Roman" w:hAnsi="Times New Roman" w:cs="Times New Roman"/>
+                <w:sz w:val="18"/>
+                <w:szCs w:val="18"/>
+                <w:lang w:val="en-US"/>
+              </w:rPr>
+              <w:t xml:space="preserve"> }}{% endif %}{% if </w:t>
+            </w:r>
+            <w:proofErr w:type="spellStart"/>
+            <w:r>
+              <w:rPr>
+                <w:rFonts w:ascii="Times New Roman" w:hAnsi="Times New Roman" w:cs="Times New Roman"/>
+                <w:sz w:val="18"/>
+                <w:szCs w:val="18"/>
+                <w:lang w:val="en-US"/>
+              </w:rPr>
+              <w:t>sts_date</w:t>
+            </w:r>
+            <w:proofErr w:type="spellEnd"/>
+            <w:r>
+              <w:rPr>
+                <w:rFonts w:ascii="Times New Roman" w:hAnsi="Times New Roman" w:cs="Times New Roman"/>
+                <w:sz w:val="18"/>
+                <w:szCs w:val="18"/>
+                <w:lang w:val="en-US"/>
+              </w:rPr>
               <w:t xml:space="preserve"> and </w:t>
             </w:r>
             <w:proofErr w:type="spellStart"/>
@@ -10011,6 +10493,43 @@
                 <w:szCs w:val="18"/>
                 <w:lang w:val="en-US"/>
               </w:rPr>
+              <w:t>sts_id</w:t>
+            </w:r>
+            <w:proofErr w:type="spellEnd"/>
+            <w:r>
+              <w:rPr>
+                <w:rFonts w:ascii="Times New Roman" w:hAnsi="Times New Roman" w:cs="Times New Roman"/>
+                <w:sz w:val="18"/>
+                <w:szCs w:val="18"/>
+                <w:lang w:val="en-US"/>
+              </w:rPr>
+              <w:t xml:space="preserve"> %} </w:t>
+            </w:r>
+            <w:r>
+              <w:rPr>
+                <w:rFonts w:ascii="Times New Roman" w:hAnsi="Times New Roman" w:cs="Times New Roman"/>
+                <w:sz w:val="18"/>
+                <w:szCs w:val="18"/>
+              </w:rPr>
+              <w:t>от</w:t>
+            </w:r>
+            <w:r>
+              <w:rPr>
+                <w:rFonts w:ascii="Times New Roman" w:hAnsi="Times New Roman" w:cs="Times New Roman"/>
+                <w:sz w:val="18"/>
+                <w:szCs w:val="18"/>
+                <w:lang w:val="en-US"/>
+              </w:rPr>
+              <w:t xml:space="preserve"> {{ </w:t>
+            </w:r>
+            <w:proofErr w:type="spellStart"/>
+            <w:r>
+              <w:rPr>
+                <w:rFonts w:ascii="Times New Roman" w:hAnsi="Times New Roman" w:cs="Times New Roman"/>
+                <w:sz w:val="18"/>
+                <w:szCs w:val="18"/>
+                <w:lang w:val="en-US"/>
+              </w:rPr>
               <w:t>sts_date</w:t>
             </w:r>
             <w:proofErr w:type="spellEnd"/>
@@ -10021,27 +10540,7 @@
                 <w:szCs w:val="18"/>
                 <w:lang w:val="en-US"/>
               </w:rPr>
-              <w:t xml:space="preserve"> </w:t>
-            </w:r>
-            <w:proofErr w:type="gramStart"/>
-            <w:r>
-              <w:rPr>
-                <w:rFonts w:ascii="Times New Roman" w:hAnsi="Times New Roman" w:cs="Times New Roman"/>
-                <w:sz w:val="18"/>
-                <w:szCs w:val="18"/>
-                <w:lang w:val="en-US"/>
-              </w:rPr>
-              <w:t>%}{</w:t>
-            </w:r>
-            <w:proofErr w:type="gramEnd"/>
-            <w:r>
-              <w:rPr>
-                <w:rFonts w:ascii="Times New Roman" w:hAnsi="Times New Roman" w:cs="Times New Roman"/>
-                <w:sz w:val="18"/>
-                <w:szCs w:val="18"/>
-                <w:lang w:val="en-US"/>
-              </w:rPr>
-              <w:t xml:space="preserve">{ </w:t>
+              <w:t xml:space="preserve"> }}{% endif %}{% if not </w:t>
             </w:r>
             <w:proofErr w:type="spellStart"/>
             <w:r>
@@ -10061,44 +10560,7 @@
                 <w:szCs w:val="18"/>
                 <w:lang w:val="en-US"/>
               </w:rPr>
-              <w:t xml:space="preserve"> }} </w:t>
-            </w:r>
-            <w:r>
-              <w:rPr>
-                <w:rFonts w:ascii="Times New Roman" w:hAnsi="Times New Roman" w:cs="Times New Roman"/>
-                <w:sz w:val="18"/>
-                <w:szCs w:val="18"/>
-              </w:rPr>
-              <w:t>от</w:t>
-            </w:r>
-            <w:r>
-              <w:rPr>
-                <w:rFonts w:ascii="Times New Roman" w:hAnsi="Times New Roman" w:cs="Times New Roman"/>
-                <w:sz w:val="18"/>
-                <w:szCs w:val="18"/>
-                <w:lang w:val="en-US"/>
-              </w:rPr>
-              <w:t xml:space="preserve"> {{ </w:t>
-            </w:r>
-            <w:proofErr w:type="spellStart"/>
-            <w:r>
-              <w:rPr>
-                <w:rFonts w:ascii="Times New Roman" w:hAnsi="Times New Roman" w:cs="Times New Roman"/>
-                <w:sz w:val="18"/>
-                <w:szCs w:val="18"/>
-                <w:lang w:val="en-US"/>
-              </w:rPr>
-              <w:t>sts_date</w:t>
-            </w:r>
-            <w:proofErr w:type="spellEnd"/>
-            <w:r>
-              <w:rPr>
-                <w:rFonts w:ascii="Times New Roman" w:hAnsi="Times New Roman" w:cs="Times New Roman"/>
-                <w:sz w:val="18"/>
-                <w:szCs w:val="18"/>
-                <w:lang w:val="en-US"/>
-              </w:rPr>
-              <w:t xml:space="preserve"> }}{% else %}</w:t>
+              <w:t xml:space="preserve"> %}</w:t>
             </w:r>
             <w:r>
               <w:rPr>
@@ -10651,77 +11113,277 @@
           <w:sz w:val="18"/>
           <w:szCs w:val="18"/>
         </w:rPr>
-        <w:t>{{</w:t>
-      </w:r>
-      <w:r>
-        <w:rPr>
-          <w:rFonts w:ascii="Times New Roman" w:hAnsi="Times New Roman" w:cs="Times New Roman"/>
-          <w:sz w:val="18"/>
-          <w:szCs w:val="18"/>
-          <w:lang w:val="en-US"/>
-        </w:rPr>
-        <w:t>pts</w:t>
-      </w:r>
-      <w:r>
-        <w:rPr>
-          <w:rFonts w:ascii="Times New Roman" w:hAnsi="Times New Roman" w:cs="Times New Roman"/>
-          <w:b/>
-          <w:bCs/>
-          <w:sz w:val="18"/>
-          <w:szCs w:val="18"/>
-        </w:rPr>
-        <w:t>_</w:t>
-      </w:r>
-      <w:r>
-        <w:rPr>
-          <w:rFonts w:ascii="Times New Roman" w:hAnsi="Times New Roman" w:cs="Times New Roman"/>
-          <w:sz w:val="18"/>
-          <w:szCs w:val="18"/>
-          <w:lang w:val="en-US"/>
-        </w:rPr>
-        <w:t>id</w:t>
-      </w:r>
-      <w:r>
-        <w:rPr>
-          <w:rFonts w:ascii="Times New Roman" w:hAnsi="Times New Roman" w:cs="Times New Roman"/>
-          <w:sz w:val="18"/>
-          <w:szCs w:val="18"/>
-        </w:rPr>
-        <w:t>}} от {{</w:t>
-      </w:r>
-      <w:r>
-        <w:rPr>
-          <w:rFonts w:ascii="Times New Roman" w:hAnsi="Times New Roman" w:cs="Times New Roman"/>
-          <w:sz w:val="18"/>
-          <w:szCs w:val="18"/>
-          <w:lang w:val="en-US"/>
-        </w:rPr>
-        <w:t>pts</w:t>
-      </w:r>
-      <w:r>
-        <w:rPr>
-          <w:rFonts w:ascii="Times New Roman" w:hAnsi="Times New Roman" w:cs="Times New Roman"/>
-          <w:sz w:val="18"/>
-          <w:szCs w:val="18"/>
-        </w:rPr>
-        <w:t>_</w:t>
-      </w:r>
-      <w:r>
-        <w:rPr>
-          <w:rFonts w:ascii="Times New Roman" w:hAnsi="Times New Roman" w:cs="Times New Roman"/>
-          <w:sz w:val="18"/>
-          <w:szCs w:val="18"/>
-          <w:lang w:val="en-US"/>
-        </w:rPr>
-        <w:t>date</w:t>
-      </w:r>
-      <w:r>
-        <w:rPr>
-          <w:rFonts w:ascii="Times New Roman" w:hAnsi="Times New Roman" w:cs="Times New Roman"/>
-          <w:sz w:val="18"/>
-          <w:szCs w:val="18"/>
-        </w:rPr>
-        <w:t>}}</w:t>
+        <w:t xml:space="preserve">{% </w:t>
+      </w:r>
+      <w:proofErr w:type="spellStart"/>
+      <w:r>
+        <w:rPr>
+          <w:rFonts w:ascii="Times New Roman" w:hAnsi="Times New Roman" w:cs="Times New Roman"/>
+          <w:sz w:val="18"/>
+          <w:szCs w:val="18"/>
+        </w:rPr>
+        <w:t>if</w:t>
+      </w:r>
+      <w:proofErr w:type="spellEnd"/>
+      <w:r>
+        <w:rPr>
+          <w:rFonts w:ascii="Times New Roman" w:hAnsi="Times New Roman" w:cs="Times New Roman"/>
+          <w:sz w:val="18"/>
+          <w:szCs w:val="18"/>
+        </w:rPr>
+        <w:t xml:space="preserve"> </w:t>
+      </w:r>
+      <w:proofErr w:type="spellStart"/>
+      <w:r>
+        <w:rPr>
+          <w:rFonts w:ascii="Times New Roman" w:hAnsi="Times New Roman" w:cs="Times New Roman"/>
+          <w:sz w:val="18"/>
+          <w:szCs w:val="18"/>
+        </w:rPr>
+        <w:t>pts_id</w:t>
+      </w:r>
+      <w:proofErr w:type="spellEnd"/>
+      <w:r>
+        <w:rPr>
+          <w:rFonts w:ascii="Times New Roman" w:hAnsi="Times New Roman" w:cs="Times New Roman"/>
+          <w:sz w:val="18"/>
+          <w:szCs w:val="18"/>
+        </w:rPr>
+        <w:t xml:space="preserve"> </w:t>
+      </w:r>
+      <w:proofErr w:type="gramStart"/>
+      <w:r>
+        <w:rPr>
+          <w:rFonts w:ascii="Times New Roman" w:hAnsi="Times New Roman" w:cs="Times New Roman"/>
+          <w:sz w:val="18"/>
+          <w:szCs w:val="18"/>
+        </w:rPr>
+        <w:t>%}{</w:t>
+      </w:r>
+      <w:proofErr w:type="gramEnd"/>
+      <w:r>
+        <w:rPr>
+          <w:rFonts w:ascii="Times New Roman" w:hAnsi="Times New Roman" w:cs="Times New Roman"/>
+          <w:sz w:val="18"/>
+          <w:szCs w:val="18"/>
+        </w:rPr>
+        <w:t xml:space="preserve">{ </w:t>
+      </w:r>
+      <w:proofErr w:type="spellStart"/>
+      <w:r>
+        <w:rPr>
+          <w:rFonts w:ascii="Times New Roman" w:hAnsi="Times New Roman" w:cs="Times New Roman"/>
+          <w:sz w:val="18"/>
+          <w:szCs w:val="18"/>
+        </w:rPr>
+        <w:t>pts_id</w:t>
+      </w:r>
+      <w:proofErr w:type="spellEnd"/>
+      <w:r>
+        <w:rPr>
+          <w:rFonts w:ascii="Times New Roman" w:hAnsi="Times New Roman" w:cs="Times New Roman"/>
+          <w:sz w:val="18"/>
+          <w:szCs w:val="18"/>
+        </w:rPr>
+        <w:t xml:space="preserve"> }}{% </w:t>
+      </w:r>
+      <w:proofErr w:type="spellStart"/>
+      <w:r>
+        <w:rPr>
+          <w:rFonts w:ascii="Times New Roman" w:hAnsi="Times New Roman" w:cs="Times New Roman"/>
+          <w:sz w:val="18"/>
+          <w:szCs w:val="18"/>
+        </w:rPr>
+        <w:t>endif</w:t>
+      </w:r>
+      <w:proofErr w:type="spellEnd"/>
+      <w:r>
+        <w:rPr>
+          <w:rFonts w:ascii="Times New Roman" w:hAnsi="Times New Roman" w:cs="Times New Roman"/>
+          <w:sz w:val="18"/>
+          <w:szCs w:val="18"/>
+        </w:rPr>
+        <w:t xml:space="preserve"> %}{% </w:t>
+      </w:r>
+      <w:proofErr w:type="spellStart"/>
+      <w:r>
+        <w:rPr>
+          <w:rFonts w:ascii="Times New Roman" w:hAnsi="Times New Roman" w:cs="Times New Roman"/>
+          <w:sz w:val="18"/>
+          <w:szCs w:val="18"/>
+        </w:rPr>
+        <w:t>if</w:t>
+      </w:r>
+      <w:proofErr w:type="spellEnd"/>
+      <w:r>
+        <w:rPr>
+          <w:rFonts w:ascii="Times New Roman" w:hAnsi="Times New Roman" w:cs="Times New Roman"/>
+          <w:sz w:val="18"/>
+          <w:szCs w:val="18"/>
+        </w:rPr>
+        <w:t xml:space="preserve"> </w:t>
+      </w:r>
+      <w:proofErr w:type="spellStart"/>
+      <w:r>
+        <w:rPr>
+          <w:rFonts w:ascii="Times New Roman" w:hAnsi="Times New Roman" w:cs="Times New Roman"/>
+          <w:sz w:val="18"/>
+          <w:szCs w:val="18"/>
+        </w:rPr>
+        <w:t>pts_date</w:t>
+      </w:r>
+      <w:proofErr w:type="spellEnd"/>
+      <w:r>
+        <w:rPr>
+          <w:rFonts w:ascii="Times New Roman" w:hAnsi="Times New Roman" w:cs="Times New Roman"/>
+          <w:sz w:val="18"/>
+          <w:szCs w:val="18"/>
+        </w:rPr>
+        <w:t xml:space="preserve"> </w:t>
+      </w:r>
+      <w:proofErr w:type="spellStart"/>
+      <w:r>
+        <w:rPr>
+          <w:rFonts w:ascii="Times New Roman" w:hAnsi="Times New Roman" w:cs="Times New Roman"/>
+          <w:sz w:val="18"/>
+          <w:szCs w:val="18"/>
+        </w:rPr>
+        <w:t>and</w:t>
+      </w:r>
+      <w:proofErr w:type="spellEnd"/>
+      <w:r>
+        <w:rPr>
+          <w:rFonts w:ascii="Times New Roman" w:hAnsi="Times New Roman" w:cs="Times New Roman"/>
+          <w:sz w:val="18"/>
+          <w:szCs w:val="18"/>
+        </w:rPr>
+        <w:t xml:space="preserve"> </w:t>
+      </w:r>
+      <w:proofErr w:type="spellStart"/>
+      <w:r>
+        <w:rPr>
+          <w:rFonts w:ascii="Times New Roman" w:hAnsi="Times New Roman" w:cs="Times New Roman"/>
+          <w:sz w:val="18"/>
+          <w:szCs w:val="18"/>
+        </w:rPr>
+        <w:t>pts_id</w:t>
+      </w:r>
+      <w:proofErr w:type="spellEnd"/>
+      <w:r>
+        <w:rPr>
+          <w:rFonts w:ascii="Times New Roman" w:hAnsi="Times New Roman" w:cs="Times New Roman"/>
+          <w:sz w:val="18"/>
+          <w:szCs w:val="18"/>
+        </w:rPr>
+        <w:t xml:space="preserve"> %} от {{ </w:t>
+      </w:r>
+      <w:proofErr w:type="spellStart"/>
+      <w:r>
+        <w:rPr>
+          <w:rFonts w:ascii="Times New Roman" w:hAnsi="Times New Roman" w:cs="Times New Roman"/>
+          <w:sz w:val="18"/>
+          <w:szCs w:val="18"/>
+        </w:rPr>
+        <w:t>pts_date</w:t>
+      </w:r>
+      <w:proofErr w:type="spellEnd"/>
+      <w:r>
+        <w:rPr>
+          <w:rFonts w:ascii="Times New Roman" w:hAnsi="Times New Roman" w:cs="Times New Roman"/>
+          <w:sz w:val="18"/>
+          <w:szCs w:val="18"/>
+        </w:rPr>
+        <w:t xml:space="preserve"> }}{% </w:t>
+      </w:r>
+      <w:proofErr w:type="spellStart"/>
+      <w:r>
+        <w:rPr>
+          <w:rFonts w:ascii="Times New Roman" w:hAnsi="Times New Roman" w:cs="Times New Roman"/>
+          <w:sz w:val="18"/>
+          <w:szCs w:val="18"/>
+        </w:rPr>
+        <w:t>endif</w:t>
+      </w:r>
+      <w:proofErr w:type="spellEnd"/>
+      <w:r>
+        <w:rPr>
+          <w:rFonts w:ascii="Times New Roman" w:hAnsi="Times New Roman" w:cs="Times New Roman"/>
+          <w:sz w:val="18"/>
+          <w:szCs w:val="18"/>
+        </w:rPr>
+        <w:t xml:space="preserve"> %}{% </w:t>
+      </w:r>
+      <w:proofErr w:type="spellStart"/>
+      <w:r>
+        <w:rPr>
+          <w:rFonts w:ascii="Times New Roman" w:hAnsi="Times New Roman" w:cs="Times New Roman"/>
+          <w:sz w:val="18"/>
+          <w:szCs w:val="18"/>
+        </w:rPr>
+        <w:t>if</w:t>
+      </w:r>
+      <w:proofErr w:type="spellEnd"/>
+      <w:r>
+        <w:rPr>
+          <w:rFonts w:ascii="Times New Roman" w:hAnsi="Times New Roman" w:cs="Times New Roman"/>
+          <w:sz w:val="18"/>
+          <w:szCs w:val="18"/>
+        </w:rPr>
+        <w:t xml:space="preserve"> </w:t>
+      </w:r>
+      <w:proofErr w:type="spellStart"/>
+      <w:r>
+        <w:rPr>
+          <w:rFonts w:ascii="Times New Roman" w:hAnsi="Times New Roman" w:cs="Times New Roman"/>
+          <w:sz w:val="18"/>
+          <w:szCs w:val="18"/>
+        </w:rPr>
+        <w:t>not</w:t>
+      </w:r>
+      <w:proofErr w:type="spellEnd"/>
+      <w:r>
+        <w:rPr>
+          <w:rFonts w:ascii="Times New Roman" w:hAnsi="Times New Roman" w:cs="Times New Roman"/>
+          <w:sz w:val="18"/>
+          <w:szCs w:val="18"/>
+        </w:rPr>
+        <w:t xml:space="preserve"> </w:t>
+      </w:r>
+      <w:proofErr w:type="spellStart"/>
+      <w:r>
+        <w:rPr>
+          <w:rFonts w:ascii="Times New Roman" w:hAnsi="Times New Roman" w:cs="Times New Roman"/>
+          <w:sz w:val="18"/>
+          <w:szCs w:val="18"/>
+        </w:rPr>
+        <w:t>pts_id</w:t>
+      </w:r>
+      <w:proofErr w:type="spellEnd"/>
+      <w:r>
+        <w:rPr>
+          <w:rFonts w:ascii="Times New Roman" w:hAnsi="Times New Roman" w:cs="Times New Roman"/>
+          <w:sz w:val="18"/>
+          <w:szCs w:val="18"/>
+        </w:rPr>
+        <w:t xml:space="preserve"> %}Отсутствует{% </w:t>
+      </w:r>
+      <w:proofErr w:type="spellStart"/>
+      <w:r>
+        <w:rPr>
+          <w:rFonts w:ascii="Times New Roman" w:hAnsi="Times New Roman" w:cs="Times New Roman"/>
+          <w:sz w:val="18"/>
+          <w:szCs w:val="18"/>
+        </w:rPr>
+        <w:t>endif</w:t>
+      </w:r>
+      <w:proofErr w:type="spellEnd"/>
+      <w:r>
+        <w:rPr>
+          <w:rFonts w:ascii="Times New Roman" w:hAnsi="Times New Roman" w:cs="Times New Roman"/>
+          <w:sz w:val="18"/>
+          <w:szCs w:val="18"/>
+        </w:rPr>
+        <w:t xml:space="preserve"> %}</w:t>
       </w:r>
     </w:p>
     <w:p>
@@ -10757,7 +11419,24 @@
           <w:sz w:val="18"/>
           <w:szCs w:val="18"/>
         </w:rPr>
-        <w:t>{{</w:t>
+        <w:t xml:space="preserve">{% </w:t>
+      </w:r>
+      <w:r>
+        <w:rPr>
+          <w:rFonts w:ascii="Times New Roman" w:hAnsi="Times New Roman" w:cs="Times New Roman"/>
+          <w:sz w:val="18"/>
+          <w:szCs w:val="18"/>
+          <w:lang w:val="en-US"/>
+        </w:rPr>
+        <w:t>if</w:t>
+      </w:r>
+      <w:r>
+        <w:rPr>
+          <w:rFonts w:ascii="Times New Roman" w:hAnsi="Times New Roman" w:cs="Times New Roman"/>
+          <w:sz w:val="18"/>
+          <w:szCs w:val="18"/>
+        </w:rPr>
+        <w:t xml:space="preserve"> </w:t>
       </w:r>
       <w:proofErr w:type="spellStart"/>
       <w:r>
@@ -10773,8 +11452,6 @@
       <w:r>
         <w:rPr>
           <w:rFonts w:ascii="Times New Roman" w:hAnsi="Times New Roman" w:cs="Times New Roman"/>
-          <w:b/>
-          <w:bCs/>
           <w:sz w:val="18"/>
           <w:szCs w:val="18"/>
         </w:rPr>
@@ -10795,7 +11472,25 @@
           <w:sz w:val="18"/>
           <w:szCs w:val="18"/>
         </w:rPr>
-        <w:t>}} от {{</w:t>
+        <w:t xml:space="preserve"> </w:t>
+      </w:r>
+      <w:proofErr w:type="gramStart"/>
+      <w:r>
+        <w:rPr>
+          <w:rFonts w:ascii="Times New Roman" w:hAnsi="Times New Roman" w:cs="Times New Roman"/>
+          <w:sz w:val="18"/>
+          <w:szCs w:val="18"/>
+        </w:rPr>
+        <w:t>%}{</w:t>
+      </w:r>
+      <w:proofErr w:type="gramEnd"/>
+      <w:r>
+        <w:rPr>
+          <w:rFonts w:ascii="Times New Roman" w:hAnsi="Times New Roman" w:cs="Times New Roman"/>
+          <w:sz w:val="18"/>
+          <w:szCs w:val="18"/>
+        </w:rPr>
+        <w:t xml:space="preserve">{ </w:t>
       </w:r>
       <w:proofErr w:type="spellStart"/>
       <w:r>
@@ -10823,6 +11518,76 @@
           <w:szCs w:val="18"/>
           <w:lang w:val="en-US"/>
         </w:rPr>
+        <w:t>id</w:t>
+      </w:r>
+      <w:r>
+        <w:rPr>
+          <w:rFonts w:ascii="Times New Roman" w:hAnsi="Times New Roman" w:cs="Times New Roman"/>
+          <w:sz w:val="18"/>
+          <w:szCs w:val="18"/>
+        </w:rPr>
+        <w:t xml:space="preserve"> }}{% </w:t>
+      </w:r>
+      <w:r>
+        <w:rPr>
+          <w:rFonts w:ascii="Times New Roman" w:hAnsi="Times New Roman" w:cs="Times New Roman"/>
+          <w:sz w:val="18"/>
+          <w:szCs w:val="18"/>
+          <w:lang w:val="en-US"/>
+        </w:rPr>
+        <w:t>endif</w:t>
+      </w:r>
+      <w:r>
+        <w:rPr>
+          <w:rFonts w:ascii="Times New Roman" w:hAnsi="Times New Roman" w:cs="Times New Roman"/>
+          <w:sz w:val="18"/>
+          <w:szCs w:val="18"/>
+        </w:rPr>
+        <w:t xml:space="preserve"> %}{% </w:t>
+      </w:r>
+      <w:r>
+        <w:rPr>
+          <w:rFonts w:ascii="Times New Roman" w:hAnsi="Times New Roman" w:cs="Times New Roman"/>
+          <w:sz w:val="18"/>
+          <w:szCs w:val="18"/>
+          <w:lang w:val="en-US"/>
+        </w:rPr>
+        <w:t>if</w:t>
+      </w:r>
+      <w:r>
+        <w:rPr>
+          <w:rFonts w:ascii="Times New Roman" w:hAnsi="Times New Roman" w:cs="Times New Roman"/>
+          <w:sz w:val="18"/>
+          <w:szCs w:val="18"/>
+        </w:rPr>
+        <w:t xml:space="preserve"> </w:t>
+      </w:r>
+      <w:proofErr w:type="spellStart"/>
+      <w:r>
+        <w:rPr>
+          <w:rFonts w:ascii="Times New Roman" w:hAnsi="Times New Roman" w:cs="Times New Roman"/>
+          <w:sz w:val="18"/>
+          <w:szCs w:val="18"/>
+          <w:lang w:val="en-US"/>
+        </w:rPr>
+        <w:t>sts</w:t>
+      </w:r>
+      <w:proofErr w:type="spellEnd"/>
+      <w:r>
+        <w:rPr>
+          <w:rFonts w:ascii="Times New Roman" w:hAnsi="Times New Roman" w:cs="Times New Roman"/>
+          <w:sz w:val="18"/>
+          <w:szCs w:val="18"/>
+        </w:rPr>
+        <w:t>_</w:t>
+      </w:r>
+      <w:r>
+        <w:rPr>
+          <w:rFonts w:ascii="Times New Roman" w:hAnsi="Times New Roman" w:cs="Times New Roman"/>
+          <w:sz w:val="18"/>
+          <w:szCs w:val="18"/>
+          <w:lang w:val="en-US"/>
+        </w:rPr>
         <w:t>date</w:t>
       </w:r>
       <w:r>
@@ -10831,7 +11596,234 @@
           <w:sz w:val="18"/>
           <w:szCs w:val="18"/>
         </w:rPr>
-        <w:t>}}</w:t>
+        <w:t xml:space="preserve"> </w:t>
+      </w:r>
+      <w:r>
+        <w:rPr>
+          <w:rFonts w:ascii="Times New Roman" w:hAnsi="Times New Roman" w:cs="Times New Roman"/>
+          <w:sz w:val="18"/>
+          <w:szCs w:val="18"/>
+          <w:lang w:val="en-US"/>
+        </w:rPr>
+        <w:t>and</w:t>
+      </w:r>
+      <w:r>
+        <w:rPr>
+          <w:rFonts w:ascii="Times New Roman" w:hAnsi="Times New Roman" w:cs="Times New Roman"/>
+          <w:sz w:val="18"/>
+          <w:szCs w:val="18"/>
+        </w:rPr>
+        <w:t xml:space="preserve"> </w:t>
+      </w:r>
+      <w:proofErr w:type="spellStart"/>
+      <w:r>
+        <w:rPr>
+          <w:rFonts w:ascii="Times New Roman" w:hAnsi="Times New Roman" w:cs="Times New Roman"/>
+          <w:sz w:val="18"/>
+          <w:szCs w:val="18"/>
+          <w:lang w:val="en-US"/>
+        </w:rPr>
+        <w:t>sts</w:t>
+      </w:r>
+      <w:proofErr w:type="spellEnd"/>
+      <w:r>
+        <w:rPr>
+          <w:rFonts w:ascii="Times New Roman" w:hAnsi="Times New Roman" w:cs="Times New Roman"/>
+          <w:sz w:val="18"/>
+          <w:szCs w:val="18"/>
+        </w:rPr>
+        <w:t>_</w:t>
+      </w:r>
+      <w:r>
+        <w:rPr>
+          <w:rFonts w:ascii="Times New Roman" w:hAnsi="Times New Roman" w:cs="Times New Roman"/>
+          <w:sz w:val="18"/>
+          <w:szCs w:val="18"/>
+          <w:lang w:val="en-US"/>
+        </w:rPr>
+        <w:t>id</w:t>
+      </w:r>
+      <w:r>
+        <w:rPr>
+          <w:rFonts w:ascii="Times New Roman" w:hAnsi="Times New Roman" w:cs="Times New Roman"/>
+          <w:sz w:val="18"/>
+          <w:szCs w:val="18"/>
+        </w:rPr>
+        <w:t xml:space="preserve"> %} </w:t>
+      </w:r>
+      <w:r>
+        <w:rPr>
+          <w:rFonts w:ascii="Times New Roman" w:hAnsi="Times New Roman" w:cs="Times New Roman"/>
+          <w:sz w:val="18"/>
+          <w:szCs w:val="18"/>
+        </w:rPr>
+        <w:t>от</w:t>
+      </w:r>
+      <w:r>
+        <w:rPr>
+          <w:rFonts w:ascii="Times New Roman" w:hAnsi="Times New Roman" w:cs="Times New Roman"/>
+          <w:sz w:val="18"/>
+          <w:szCs w:val="18"/>
+        </w:rPr>
+        <w:t xml:space="preserve"> {{ </w:t>
+      </w:r>
+      <w:proofErr w:type="spellStart"/>
+      <w:r>
+        <w:rPr>
+          <w:rFonts w:ascii="Times New Roman" w:hAnsi="Times New Roman" w:cs="Times New Roman"/>
+          <w:sz w:val="18"/>
+          <w:szCs w:val="18"/>
+          <w:lang w:val="en-US"/>
+        </w:rPr>
+        <w:t>sts</w:t>
+      </w:r>
+      <w:proofErr w:type="spellEnd"/>
+      <w:r>
+        <w:rPr>
+          <w:rFonts w:ascii="Times New Roman" w:hAnsi="Times New Roman" w:cs="Times New Roman"/>
+          <w:sz w:val="18"/>
+          <w:szCs w:val="18"/>
+        </w:rPr>
+        <w:t>_</w:t>
+      </w:r>
+      <w:r>
+        <w:rPr>
+          <w:rFonts w:ascii="Times New Roman" w:hAnsi="Times New Roman" w:cs="Times New Roman"/>
+          <w:sz w:val="18"/>
+          <w:szCs w:val="18"/>
+          <w:lang w:val="en-US"/>
+        </w:rPr>
+        <w:t>date</w:t>
+      </w:r>
+      <w:r>
+        <w:rPr>
+          <w:rFonts w:ascii="Times New Roman" w:hAnsi="Times New Roman" w:cs="Times New Roman"/>
+          <w:sz w:val="18"/>
+          <w:szCs w:val="18"/>
+        </w:rPr>
+        <w:t xml:space="preserve"> }}{% </w:t>
+      </w:r>
+      <w:r>
+        <w:rPr>
+          <w:rFonts w:ascii="Times New Roman" w:hAnsi="Times New Roman" w:cs="Times New Roman"/>
+          <w:sz w:val="18"/>
+          <w:szCs w:val="18"/>
+          <w:lang w:val="en-US"/>
+        </w:rPr>
+        <w:t>endif</w:t>
+      </w:r>
+      <w:r>
+        <w:rPr>
+          <w:rFonts w:ascii="Times New Roman" w:hAnsi="Times New Roman" w:cs="Times New Roman"/>
+          <w:sz w:val="18"/>
+          <w:szCs w:val="18"/>
+        </w:rPr>
+        <w:t xml:space="preserve"> %}{% </w:t>
+      </w:r>
+      <w:r>
+        <w:rPr>
+          <w:rFonts w:ascii="Times New Roman" w:hAnsi="Times New Roman" w:cs="Times New Roman"/>
+          <w:sz w:val="18"/>
+          <w:szCs w:val="18"/>
+          <w:lang w:val="en-US"/>
+        </w:rPr>
+        <w:t>if</w:t>
+      </w:r>
+      <w:r>
+        <w:rPr>
+          <w:rFonts w:ascii="Times New Roman" w:hAnsi="Times New Roman" w:cs="Times New Roman"/>
+          <w:sz w:val="18"/>
+          <w:szCs w:val="18"/>
+        </w:rPr>
+        <w:t xml:space="preserve"> </w:t>
+      </w:r>
+      <w:r>
+        <w:rPr>
+          <w:rFonts w:ascii="Times New Roman" w:hAnsi="Times New Roman" w:cs="Times New Roman"/>
+          <w:sz w:val="18"/>
+          <w:szCs w:val="18"/>
+          <w:lang w:val="en-US"/>
+        </w:rPr>
+        <w:t>not</w:t>
+      </w:r>
+      <w:r>
+        <w:rPr>
+          <w:rFonts w:ascii="Times New Roman" w:hAnsi="Times New Roman" w:cs="Times New Roman"/>
+          <w:sz w:val="18"/>
+          <w:szCs w:val="18"/>
+        </w:rPr>
+        <w:t xml:space="preserve"> </w:t>
+      </w:r>
+      <w:proofErr w:type="spellStart"/>
+      <w:r>
+        <w:rPr>
+          <w:rFonts w:ascii="Times New Roman" w:hAnsi="Times New Roman" w:cs="Times New Roman"/>
+          <w:sz w:val="18"/>
+          <w:szCs w:val="18"/>
+          <w:lang w:val="en-US"/>
+        </w:rPr>
+        <w:t>sts</w:t>
+      </w:r>
+      <w:proofErr w:type="spellEnd"/>
+      <w:r>
+        <w:rPr>
+          <w:rFonts w:ascii="Times New Roman" w:hAnsi="Times New Roman" w:cs="Times New Roman"/>
+          <w:sz w:val="18"/>
+          <w:szCs w:val="18"/>
+        </w:rPr>
+        <w:t>_</w:t>
+      </w:r>
+      <w:proofErr w:type="spellStart"/>
+      <w:r>
+        <w:rPr>
+          <w:rFonts w:ascii="Times New Roman" w:hAnsi="Times New Roman" w:cs="Times New Roman"/>
+          <w:sz w:val="18"/>
+          <w:szCs w:val="18"/>
+          <w:lang w:val="en-US"/>
+        </w:rPr>
+        <w:t>id</w:t>
+      </w:r>
+      <w:proofErr w:type="spellEnd"/>
+      <w:r>
+        <w:rPr>
+          <w:rFonts w:ascii="Times New Roman" w:hAnsi="Times New Roman" w:cs="Times New Roman"/>
+          <w:sz w:val="18"/>
+          <w:szCs w:val="18"/>
+        </w:rPr>
+        <w:t xml:space="preserve"> %}</w:t>
+      </w:r>
+      <w:r>
+        <w:rPr>
+          <w:rFonts w:ascii="Times New Roman" w:hAnsi="Times New Roman" w:cs="Times New Roman"/>
+          <w:sz w:val="18"/>
+          <w:szCs w:val="18"/>
+        </w:rPr>
+        <w:t>Отсутствует</w:t>
+      </w:r>
+      <w:r>
+        <w:rPr>
+          <w:rFonts w:ascii="Times New Roman" w:hAnsi="Times New Roman" w:cs="Times New Roman"/>
+          <w:sz w:val="18"/>
+          <w:szCs w:val="18"/>
+        </w:rPr>
+        <w:t xml:space="preserve">{% </w:t>
+      </w:r>
+      <w:r>
+        <w:rPr>
+          <w:rFonts w:ascii="Times New Roman" w:hAnsi="Times New Roman" w:cs="Times New Roman"/>
+          <w:sz w:val="18"/>
+          <w:szCs w:val="18"/>
+          <w:lang w:val="en-US"/>
+        </w:rPr>
+        <w:t>endif</w:t>
+      </w:r>
+      <w:r>
+        <w:rPr>
+          <w:rFonts w:ascii="Times New Roman" w:hAnsi="Times New Roman" w:cs="Times New Roman"/>
+          <w:sz w:val="18"/>
+          <w:szCs w:val="18"/>
+        </w:rPr>
+        <w:t xml:space="preserve"> %}</w:t>
       </w:r>
     </w:p>
     <w:p>
@@ -13635,6 +14627,7 @@
                 <w:sz w:val="18"/>
                 <w:szCs w:val="18"/>
               </w:rPr>
+              <w:lastRenderedPageBreak/>
               <w:t xml:space="preserve"> </w:t>
             </w:r>
           </w:p>
@@ -13857,7 +14850,6 @@
                 <w:szCs w:val="18"/>
                 <w:lang w:val="en-US"/>
               </w:rPr>
-              <w:lastRenderedPageBreak/>
               <w:t>}}</w:t>
             </w:r>
             <w:r>
@@ -16500,7 +17492,6 @@
                 <w:rFonts w:ascii="Times New Roman" w:hAnsi="Times New Roman" w:cs="Times New Roman"/>
                 <w:sz w:val="18"/>
                 <w:szCs w:val="18"/>
-                <w:lang w:val="en-US"/>
               </w:rPr>
             </w:pPr>
             <w:r>
@@ -16508,9 +17499,8 @@
                 <w:rFonts w:ascii="Times New Roman" w:hAnsi="Times New Roman" w:cs="Times New Roman"/>
                 <w:sz w:val="18"/>
                 <w:szCs w:val="18"/>
-                <w:lang w:val="en-US"/>
-              </w:rPr>
-              <w:t>{{</w:t>
+              </w:rPr>
+              <w:t xml:space="preserve">{% </w:t>
             </w:r>
             <w:proofErr w:type="spellStart"/>
             <w:r>
@@ -16518,29 +17508,8 @@
                 <w:rFonts w:ascii="Times New Roman" w:hAnsi="Times New Roman" w:cs="Times New Roman"/>
                 <w:sz w:val="18"/>
                 <w:szCs w:val="18"/>
-                <w:lang w:val="en-US"/>
-              </w:rPr>
-              <w:t>pts</w:t>
-            </w:r>
-            <w:r>
-              <w:rPr>
-                <w:rFonts w:ascii="Times New Roman" w:hAnsi="Times New Roman" w:cs="Times New Roman"/>
-                <w:b/>
-                <w:bCs/>
-                <w:sz w:val="18"/>
-                <w:szCs w:val="18"/>
-                <w:lang w:val="en-US"/>
-              </w:rPr>
-              <w:t>_</w:t>
-            </w:r>
-            <w:r>
-              <w:rPr>
-                <w:rFonts w:ascii="Times New Roman" w:hAnsi="Times New Roman" w:cs="Times New Roman"/>
-                <w:sz w:val="18"/>
-                <w:szCs w:val="18"/>
-                <w:lang w:val="en-US"/>
-              </w:rPr>
-              <w:t>id</w:t>
+              </w:rPr>
+              <w:t>if</w:t>
             </w:r>
             <w:proofErr w:type="spellEnd"/>
             <w:r>
@@ -16548,26 +17517,8 @@
                 <w:rFonts w:ascii="Times New Roman" w:hAnsi="Times New Roman" w:cs="Times New Roman"/>
                 <w:sz w:val="18"/>
                 <w:szCs w:val="18"/>
-                <w:lang w:val="en-US"/>
-              </w:rPr>
-              <w:t xml:space="preserve">}} </w:t>
-            </w:r>
-            <w:r>
-              <w:rPr>
-                <w:rFonts w:ascii="Times New Roman" w:hAnsi="Times New Roman" w:cs="Times New Roman"/>
-                <w:sz w:val="18"/>
-                <w:szCs w:val="18"/>
-              </w:rPr>
-              <w:t>от</w:t>
-            </w:r>
-            <w:r>
-              <w:rPr>
-                <w:rFonts w:ascii="Times New Roman" w:hAnsi="Times New Roman" w:cs="Times New Roman"/>
-                <w:sz w:val="18"/>
-                <w:szCs w:val="18"/>
-                <w:lang w:val="en-US"/>
-              </w:rPr>
-              <w:t xml:space="preserve"> {{</w:t>
+              </w:rPr>
+              <w:t xml:space="preserve"> </w:t>
             </w:r>
             <w:proofErr w:type="spellStart"/>
             <w:r>
@@ -16575,7 +17526,96 @@
                 <w:rFonts w:ascii="Times New Roman" w:hAnsi="Times New Roman" w:cs="Times New Roman"/>
                 <w:sz w:val="18"/>
                 <w:szCs w:val="18"/>
-                <w:lang w:val="en-US"/>
+              </w:rPr>
+              <w:t>pts_id</w:t>
+            </w:r>
+            <w:proofErr w:type="spellEnd"/>
+            <w:r>
+              <w:rPr>
+                <w:rFonts w:ascii="Times New Roman" w:hAnsi="Times New Roman" w:cs="Times New Roman"/>
+                <w:sz w:val="18"/>
+                <w:szCs w:val="18"/>
+              </w:rPr>
+              <w:t xml:space="preserve"> </w:t>
+            </w:r>
+            <w:proofErr w:type="gramStart"/>
+            <w:r>
+              <w:rPr>
+                <w:rFonts w:ascii="Times New Roman" w:hAnsi="Times New Roman" w:cs="Times New Roman"/>
+                <w:sz w:val="18"/>
+                <w:szCs w:val="18"/>
+              </w:rPr>
+              <w:t>%}{</w:t>
+            </w:r>
+            <w:proofErr w:type="gramEnd"/>
+            <w:r>
+              <w:rPr>
+                <w:rFonts w:ascii="Times New Roman" w:hAnsi="Times New Roman" w:cs="Times New Roman"/>
+                <w:sz w:val="18"/>
+                <w:szCs w:val="18"/>
+              </w:rPr>
+              <w:t xml:space="preserve">{ </w:t>
+            </w:r>
+            <w:proofErr w:type="spellStart"/>
+            <w:r>
+              <w:rPr>
+                <w:rFonts w:ascii="Times New Roman" w:hAnsi="Times New Roman" w:cs="Times New Roman"/>
+                <w:sz w:val="18"/>
+                <w:szCs w:val="18"/>
+              </w:rPr>
+              <w:t>pts_id</w:t>
+            </w:r>
+            <w:proofErr w:type="spellEnd"/>
+            <w:r>
+              <w:rPr>
+                <w:rFonts w:ascii="Times New Roman" w:hAnsi="Times New Roman" w:cs="Times New Roman"/>
+                <w:sz w:val="18"/>
+                <w:szCs w:val="18"/>
+              </w:rPr>
+              <w:t xml:space="preserve"> }}{% </w:t>
+            </w:r>
+            <w:proofErr w:type="spellStart"/>
+            <w:r>
+              <w:rPr>
+                <w:rFonts w:ascii="Times New Roman" w:hAnsi="Times New Roman" w:cs="Times New Roman"/>
+                <w:sz w:val="18"/>
+                <w:szCs w:val="18"/>
+              </w:rPr>
+              <w:t>endif</w:t>
+            </w:r>
+            <w:proofErr w:type="spellEnd"/>
+            <w:r>
+              <w:rPr>
+                <w:rFonts w:ascii="Times New Roman" w:hAnsi="Times New Roman" w:cs="Times New Roman"/>
+                <w:sz w:val="18"/>
+                <w:szCs w:val="18"/>
+              </w:rPr>
+              <w:t xml:space="preserve"> %}{% </w:t>
+            </w:r>
+            <w:proofErr w:type="spellStart"/>
+            <w:r>
+              <w:rPr>
+                <w:rFonts w:ascii="Times New Roman" w:hAnsi="Times New Roman" w:cs="Times New Roman"/>
+                <w:sz w:val="18"/>
+                <w:szCs w:val="18"/>
+              </w:rPr>
+              <w:t>if</w:t>
+            </w:r>
+            <w:proofErr w:type="spellEnd"/>
+            <w:r>
+              <w:rPr>
+                <w:rFonts w:ascii="Times New Roman" w:hAnsi="Times New Roman" w:cs="Times New Roman"/>
+                <w:sz w:val="18"/>
+                <w:szCs w:val="18"/>
+              </w:rPr>
+              <w:t xml:space="preserve"> </w:t>
+            </w:r>
+            <w:proofErr w:type="spellStart"/>
+            <w:r>
+              <w:rPr>
+                <w:rFonts w:ascii="Times New Roman" w:hAnsi="Times New Roman" w:cs="Times New Roman"/>
+                <w:sz w:val="18"/>
+                <w:szCs w:val="18"/>
               </w:rPr>
               <w:t>pts_date</w:t>
             </w:r>
@@ -16585,9 +17625,152 @@
                 <w:rFonts w:ascii="Times New Roman" w:hAnsi="Times New Roman" w:cs="Times New Roman"/>
                 <w:sz w:val="18"/>
                 <w:szCs w:val="18"/>
-                <w:lang w:val="en-US"/>
-              </w:rPr>
-              <w:t>}}</w:t>
+              </w:rPr>
+              <w:t xml:space="preserve"> </w:t>
+            </w:r>
+            <w:proofErr w:type="spellStart"/>
+            <w:r>
+              <w:rPr>
+                <w:rFonts w:ascii="Times New Roman" w:hAnsi="Times New Roman" w:cs="Times New Roman"/>
+                <w:sz w:val="18"/>
+                <w:szCs w:val="18"/>
+              </w:rPr>
+              <w:t>and</w:t>
+            </w:r>
+            <w:proofErr w:type="spellEnd"/>
+            <w:r>
+              <w:rPr>
+                <w:rFonts w:ascii="Times New Roman" w:hAnsi="Times New Roman" w:cs="Times New Roman"/>
+                <w:sz w:val="18"/>
+                <w:szCs w:val="18"/>
+              </w:rPr>
+              <w:t xml:space="preserve"> </w:t>
+            </w:r>
+            <w:proofErr w:type="spellStart"/>
+            <w:r>
+              <w:rPr>
+                <w:rFonts w:ascii="Times New Roman" w:hAnsi="Times New Roman" w:cs="Times New Roman"/>
+                <w:sz w:val="18"/>
+                <w:szCs w:val="18"/>
+              </w:rPr>
+              <w:t>pts_id</w:t>
+            </w:r>
+            <w:proofErr w:type="spellEnd"/>
+            <w:r>
+              <w:rPr>
+                <w:rFonts w:ascii="Times New Roman" w:hAnsi="Times New Roman" w:cs="Times New Roman"/>
+                <w:sz w:val="18"/>
+                <w:szCs w:val="18"/>
+              </w:rPr>
+              <w:t xml:space="preserve"> %} от {{ </w:t>
+            </w:r>
+            <w:proofErr w:type="spellStart"/>
+            <w:r>
+              <w:rPr>
+                <w:rFonts w:ascii="Times New Roman" w:hAnsi="Times New Roman" w:cs="Times New Roman"/>
+                <w:sz w:val="18"/>
+                <w:szCs w:val="18"/>
+              </w:rPr>
+              <w:t>pts_date</w:t>
+            </w:r>
+            <w:proofErr w:type="spellEnd"/>
+            <w:r>
+              <w:rPr>
+                <w:rFonts w:ascii="Times New Roman" w:hAnsi="Times New Roman" w:cs="Times New Roman"/>
+                <w:sz w:val="18"/>
+                <w:szCs w:val="18"/>
+              </w:rPr>
+              <w:t xml:space="preserve"> }}{% </w:t>
+            </w:r>
+            <w:proofErr w:type="spellStart"/>
+            <w:r>
+              <w:rPr>
+                <w:rFonts w:ascii="Times New Roman" w:hAnsi="Times New Roman" w:cs="Times New Roman"/>
+                <w:sz w:val="18"/>
+                <w:szCs w:val="18"/>
+              </w:rPr>
+              <w:t>endif</w:t>
+            </w:r>
+            <w:proofErr w:type="spellEnd"/>
+            <w:r>
+              <w:rPr>
+                <w:rFonts w:ascii="Times New Roman" w:hAnsi="Times New Roman" w:cs="Times New Roman"/>
+                <w:sz w:val="18"/>
+                <w:szCs w:val="18"/>
+              </w:rPr>
+              <w:t xml:space="preserve"> %}{% </w:t>
+            </w:r>
+            <w:proofErr w:type="spellStart"/>
+            <w:r>
+              <w:rPr>
+                <w:rFonts w:ascii="Times New Roman" w:hAnsi="Times New Roman" w:cs="Times New Roman"/>
+                <w:sz w:val="18"/>
+                <w:szCs w:val="18"/>
+              </w:rPr>
+              <w:t>if</w:t>
+            </w:r>
+            <w:proofErr w:type="spellEnd"/>
+            <w:r>
+              <w:rPr>
+                <w:rFonts w:ascii="Times New Roman" w:hAnsi="Times New Roman" w:cs="Times New Roman"/>
+                <w:sz w:val="18"/>
+                <w:szCs w:val="18"/>
+              </w:rPr>
+              <w:t xml:space="preserve"> </w:t>
+            </w:r>
+            <w:proofErr w:type="spellStart"/>
+            <w:r>
+              <w:rPr>
+                <w:rFonts w:ascii="Times New Roman" w:hAnsi="Times New Roman" w:cs="Times New Roman"/>
+                <w:sz w:val="18"/>
+                <w:szCs w:val="18"/>
+              </w:rPr>
+              <w:t>not</w:t>
+            </w:r>
+            <w:proofErr w:type="spellEnd"/>
+            <w:r>
+              <w:rPr>
+                <w:rFonts w:ascii="Times New Roman" w:hAnsi="Times New Roman" w:cs="Times New Roman"/>
+                <w:sz w:val="18"/>
+                <w:szCs w:val="18"/>
+              </w:rPr>
+              <w:t xml:space="preserve"> </w:t>
+            </w:r>
+            <w:proofErr w:type="spellStart"/>
+            <w:r>
+              <w:rPr>
+                <w:rFonts w:ascii="Times New Roman" w:hAnsi="Times New Roman" w:cs="Times New Roman"/>
+                <w:sz w:val="18"/>
+                <w:szCs w:val="18"/>
+              </w:rPr>
+              <w:t>pts_id</w:t>
+            </w:r>
+            <w:proofErr w:type="spellEnd"/>
+            <w:r>
+              <w:rPr>
+                <w:rFonts w:ascii="Times New Roman" w:hAnsi="Times New Roman" w:cs="Times New Roman"/>
+                <w:sz w:val="18"/>
+                <w:szCs w:val="18"/>
+              </w:rPr>
+              <w:t xml:space="preserve"> %}Отсутствует{% </w:t>
+            </w:r>
+            <w:proofErr w:type="spellStart"/>
+            <w:r>
+              <w:rPr>
+                <w:rFonts w:ascii="Times New Roman" w:hAnsi="Times New Roman" w:cs="Times New Roman"/>
+                <w:sz w:val="18"/>
+                <w:szCs w:val="18"/>
+              </w:rPr>
+              <w:t>endif</w:t>
+            </w:r>
+            <w:proofErr w:type="spellEnd"/>
+            <w:r>
+              <w:rPr>
+                <w:rFonts w:ascii="Times New Roman" w:hAnsi="Times New Roman" w:cs="Times New Roman"/>
+                <w:sz w:val="18"/>
+                <w:szCs w:val="18"/>
+              </w:rPr>
+              <w:t xml:space="preserve"> %}</w:t>
             </w:r>
           </w:p>
         </w:tc>
@@ -16684,6 +17867,66 @@
                 <w:szCs w:val="18"/>
                 <w:lang w:val="en-US"/>
               </w:rPr>
+              <w:t xml:space="preserve"> </w:t>
+            </w:r>
+            <w:proofErr w:type="gramStart"/>
+            <w:r>
+              <w:rPr>
+                <w:rFonts w:ascii="Times New Roman" w:hAnsi="Times New Roman" w:cs="Times New Roman"/>
+                <w:sz w:val="18"/>
+                <w:szCs w:val="18"/>
+                <w:lang w:val="en-US"/>
+              </w:rPr>
+              <w:t>%}{</w:t>
+            </w:r>
+            <w:proofErr w:type="gramEnd"/>
+            <w:r>
+              <w:rPr>
+                <w:rFonts w:ascii="Times New Roman" w:hAnsi="Times New Roman" w:cs="Times New Roman"/>
+                <w:sz w:val="18"/>
+                <w:szCs w:val="18"/>
+                <w:lang w:val="en-US"/>
+              </w:rPr>
+              <w:t xml:space="preserve">{ </w:t>
+            </w:r>
+            <w:proofErr w:type="spellStart"/>
+            <w:r>
+              <w:rPr>
+                <w:rFonts w:ascii="Times New Roman" w:hAnsi="Times New Roman" w:cs="Times New Roman"/>
+                <w:sz w:val="18"/>
+                <w:szCs w:val="18"/>
+                <w:lang w:val="en-US"/>
+              </w:rPr>
+              <w:t>sts_id</w:t>
+            </w:r>
+            <w:proofErr w:type="spellEnd"/>
+            <w:r>
+              <w:rPr>
+                <w:rFonts w:ascii="Times New Roman" w:hAnsi="Times New Roman" w:cs="Times New Roman"/>
+                <w:sz w:val="18"/>
+                <w:szCs w:val="18"/>
+                <w:lang w:val="en-US"/>
+              </w:rPr>
+              <w:t xml:space="preserve"> }}{% endif %}{% if </w:t>
+            </w:r>
+            <w:proofErr w:type="spellStart"/>
+            <w:r>
+              <w:rPr>
+                <w:rFonts w:ascii="Times New Roman" w:hAnsi="Times New Roman" w:cs="Times New Roman"/>
+                <w:sz w:val="18"/>
+                <w:szCs w:val="18"/>
+                <w:lang w:val="en-US"/>
+              </w:rPr>
+              <w:t>sts_date</w:t>
+            </w:r>
+            <w:proofErr w:type="spellEnd"/>
+            <w:r>
+              <w:rPr>
+                <w:rFonts w:ascii="Times New Roman" w:hAnsi="Times New Roman" w:cs="Times New Roman"/>
+                <w:sz w:val="18"/>
+                <w:szCs w:val="18"/>
+                <w:lang w:val="en-US"/>
+              </w:rPr>
               <w:t xml:space="preserve"> and </w:t>
             </w:r>
             <w:proofErr w:type="spellStart"/>
@@ -16694,6 +17937,43 @@
                 <w:szCs w:val="18"/>
                 <w:lang w:val="en-US"/>
               </w:rPr>
+              <w:t>sts_id</w:t>
+            </w:r>
+            <w:proofErr w:type="spellEnd"/>
+            <w:r>
+              <w:rPr>
+                <w:rFonts w:ascii="Times New Roman" w:hAnsi="Times New Roman" w:cs="Times New Roman"/>
+                <w:sz w:val="18"/>
+                <w:szCs w:val="18"/>
+                <w:lang w:val="en-US"/>
+              </w:rPr>
+              <w:t xml:space="preserve"> %} </w:t>
+            </w:r>
+            <w:r>
+              <w:rPr>
+                <w:rFonts w:ascii="Times New Roman" w:hAnsi="Times New Roman" w:cs="Times New Roman"/>
+                <w:sz w:val="18"/>
+                <w:szCs w:val="18"/>
+              </w:rPr>
+              <w:t>от</w:t>
+            </w:r>
+            <w:r>
+              <w:rPr>
+                <w:rFonts w:ascii="Times New Roman" w:hAnsi="Times New Roman" w:cs="Times New Roman"/>
+                <w:sz w:val="18"/>
+                <w:szCs w:val="18"/>
+                <w:lang w:val="en-US"/>
+              </w:rPr>
+              <w:t xml:space="preserve"> {{ </w:t>
+            </w:r>
+            <w:proofErr w:type="spellStart"/>
+            <w:r>
+              <w:rPr>
+                <w:rFonts w:ascii="Times New Roman" w:hAnsi="Times New Roman" w:cs="Times New Roman"/>
+                <w:sz w:val="18"/>
+                <w:szCs w:val="18"/>
+                <w:lang w:val="en-US"/>
+              </w:rPr>
               <w:t>sts_date</w:t>
             </w:r>
             <w:proofErr w:type="spellEnd"/>
@@ -16704,27 +17984,7 @@
                 <w:szCs w:val="18"/>
                 <w:lang w:val="en-US"/>
               </w:rPr>
-              <w:t xml:space="preserve"> </w:t>
-            </w:r>
-            <w:proofErr w:type="gramStart"/>
-            <w:r>
-              <w:rPr>
-                <w:rFonts w:ascii="Times New Roman" w:hAnsi="Times New Roman" w:cs="Times New Roman"/>
-                <w:sz w:val="18"/>
-                <w:szCs w:val="18"/>
-                <w:lang w:val="en-US"/>
-              </w:rPr>
-              <w:t>%}{</w:t>
-            </w:r>
-            <w:proofErr w:type="gramEnd"/>
-            <w:r>
-              <w:rPr>
-                <w:rFonts w:ascii="Times New Roman" w:hAnsi="Times New Roman" w:cs="Times New Roman"/>
-                <w:sz w:val="18"/>
-                <w:szCs w:val="18"/>
-                <w:lang w:val="en-US"/>
-              </w:rPr>
-              <w:t xml:space="preserve">{ </w:t>
+              <w:t xml:space="preserve"> }}{% endif %}{% if not </w:t>
             </w:r>
             <w:proofErr w:type="spellStart"/>
             <w:r>
@@ -16744,44 +18004,7 @@
                 <w:szCs w:val="18"/>
                 <w:lang w:val="en-US"/>
               </w:rPr>
-              <w:t xml:space="preserve"> }} </w:t>
-            </w:r>
-            <w:r>
-              <w:rPr>
-                <w:rFonts w:ascii="Times New Roman" w:hAnsi="Times New Roman" w:cs="Times New Roman"/>
-                <w:sz w:val="18"/>
-                <w:szCs w:val="18"/>
-              </w:rPr>
-              <w:t>от</w:t>
-            </w:r>
-            <w:r>
-              <w:rPr>
-                <w:rFonts w:ascii="Times New Roman" w:hAnsi="Times New Roman" w:cs="Times New Roman"/>
-                <w:sz w:val="18"/>
-                <w:szCs w:val="18"/>
-                <w:lang w:val="en-US"/>
-              </w:rPr>
-              <w:t xml:space="preserve"> {{ </w:t>
-            </w:r>
-            <w:proofErr w:type="spellStart"/>
-            <w:r>
-              <w:rPr>
-                <w:rFonts w:ascii="Times New Roman" w:hAnsi="Times New Roman" w:cs="Times New Roman"/>
-                <w:sz w:val="18"/>
-                <w:szCs w:val="18"/>
-                <w:lang w:val="en-US"/>
-              </w:rPr>
-              <w:t>sts_date</w:t>
-            </w:r>
-            <w:proofErr w:type="spellEnd"/>
-            <w:r>
-              <w:rPr>
-                <w:rFonts w:ascii="Times New Roman" w:hAnsi="Times New Roman" w:cs="Times New Roman"/>
-                <w:sz w:val="18"/>
-                <w:szCs w:val="18"/>
-                <w:lang w:val="en-US"/>
-              </w:rPr>
-              <w:t xml:space="preserve"> }}{% else %}</w:t>
+              <w:t xml:space="preserve"> %}</w:t>
             </w:r>
             <w:r>
               <w:rPr>

</xml_diff>

<commit_message>
Made com return work properly, fixed bugs
</commit_message>
<xml_diff>
--- a/documents/templates/1_comissions(Договор поручения).docx
+++ b/documents/templates/1_comissions(Договор поручения).docx
@@ -7434,17 +7434,7 @@
                 <w:szCs w:val="18"/>
                 <w:lang w:val="en-US"/>
               </w:rPr>
-              <w:t>buyer_</w:t>
-            </w:r>
-            <w:r>
-              <w:rPr>
-                <w:rFonts w:ascii="Times New Roman" w:hAnsi="Times New Roman" w:cs="Times New Roman"/>
-                <w:bCs/>
-                <w:sz w:val="18"/>
-                <w:szCs w:val="18"/>
-                <w:lang w:val="en-US"/>
-              </w:rPr>
-              <w:t>director_position</w:t>
+              <w:t>buyer_shorten_director_position</w:t>
             </w:r>
             <w:proofErr w:type="spellEnd"/>
           </w:p>
@@ -11773,7 +11763,6 @@
         </w:rPr>
         <w:t>_</w:t>
       </w:r>
-      <w:proofErr w:type="spellStart"/>
       <w:r>
         <w:rPr>
           <w:rFonts w:ascii="Times New Roman" w:hAnsi="Times New Roman" w:cs="Times New Roman"/>
@@ -11783,7 +11772,6 @@
         </w:rPr>
         <w:t>id</w:t>
       </w:r>
-      <w:proofErr w:type="spellEnd"/>
       <w:r>
         <w:rPr>
           <w:rFonts w:ascii="Times New Roman" w:hAnsi="Times New Roman" w:cs="Times New Roman"/>
@@ -14815,17 +14803,7 @@
                 <w:szCs w:val="18"/>
                 <w:lang w:val="en-US"/>
               </w:rPr>
-              <w:t>buyer_</w:t>
-            </w:r>
-            <w:r>
-              <w:rPr>
-                <w:rFonts w:ascii="Times New Roman" w:hAnsi="Times New Roman" w:cs="Times New Roman"/>
-                <w:bCs/>
-                <w:sz w:val="18"/>
-                <w:szCs w:val="18"/>
-                <w:lang w:val="en-US"/>
-              </w:rPr>
-              <w:t>director_position</w:t>
+              <w:t>buyer_shorten_director_position</w:t>
             </w:r>
             <w:proofErr w:type="spellEnd"/>
           </w:p>
@@ -18955,6 +18933,7 @@
           <w:bCs/>
           <w:sz w:val="18"/>
           <w:szCs w:val="18"/>
+          <w:lang w:val="en-US"/>
         </w:rPr>
       </w:pPr>
       <w:r>
@@ -19003,7 +18982,7 @@
           <w:iCs/>
           <w:sz w:val="18"/>
           <w:szCs w:val="18"/>
-          <w:lang w:eastAsia="ru-RU"/>
+          <w:lang w:val="en-US" w:eastAsia="ru-RU"/>
         </w:rPr>
         <w:t xml:space="preserve">: </w:t>
       </w:r>
@@ -19013,29 +18992,31 @@
           <w:iCs/>
           <w:sz w:val="18"/>
           <w:szCs w:val="18"/>
-          <w:lang w:eastAsia="ru-RU"/>
-        </w:rPr>
-        <w:t>Ген</w:t>
-      </w:r>
+          <w:lang w:val="en-US" w:eastAsia="ru-RU"/>
+        </w:rPr>
+        <w:t>{{</w:t>
+      </w:r>
+      <w:proofErr w:type="spellStart"/>
       <w:r>
         <w:rPr>
           <w:rFonts w:ascii="Times New Roman" w:eastAsia="Times New Roman" w:hAnsi="Times New Roman" w:cs="Times New Roman"/>
           <w:iCs/>
           <w:sz w:val="18"/>
           <w:szCs w:val="18"/>
-          <w:lang w:eastAsia="ru-RU"/>
-        </w:rPr>
-        <w:t xml:space="preserve">. </w:t>
-      </w:r>
+          <w:lang w:val="en-US" w:eastAsia="ru-RU"/>
+        </w:rPr>
+        <w:t>buyer_shorten_director_position</w:t>
+      </w:r>
+      <w:proofErr w:type="spellEnd"/>
       <w:r>
         <w:rPr>
           <w:rFonts w:ascii="Times New Roman" w:eastAsia="Times New Roman" w:hAnsi="Times New Roman" w:cs="Times New Roman"/>
           <w:iCs/>
           <w:sz w:val="18"/>
           <w:szCs w:val="18"/>
-          <w:lang w:eastAsia="ru-RU"/>
-        </w:rPr>
-        <w:t>Директор</w:t>
+          <w:lang w:val="en-US" w:eastAsia="ru-RU"/>
+        </w:rPr>
+        <w:t>}}</w:t>
       </w:r>
       <w:r>
         <w:rPr>
@@ -19043,7 +19024,7 @@
           <w:iCs/>
           <w:sz w:val="18"/>
           <w:szCs w:val="18"/>
-          <w:lang w:eastAsia="ru-RU"/>
+          <w:lang w:val="en-US" w:eastAsia="ru-RU"/>
         </w:rPr>
         <w:t xml:space="preserve"> </w:t>
       </w:r>
@@ -19052,6 +19033,7 @@
           <w:rFonts w:ascii="Times New Roman" w:hAnsi="Times New Roman" w:cs="Times New Roman"/>
           <w:sz w:val="18"/>
           <w:szCs w:val="18"/>
+          <w:lang w:val="en-US"/>
         </w:rPr>
         <w:t>____________________/</w:t>
       </w:r>
@@ -19061,9 +19043,11 @@
           <w:bCs/>
           <w:sz w:val="18"/>
           <w:szCs w:val="18"/>
+          <w:lang w:val="en-US"/>
         </w:rPr>
         <w:t>{{</w:t>
       </w:r>
+      <w:proofErr w:type="spellStart"/>
       <w:r>
         <w:rPr>
           <w:rFonts w:ascii="Times New Roman" w:hAnsi="Times New Roman" w:cs="Times New Roman"/>
@@ -19080,6 +19064,7 @@
           <w:bCs/>
           <w:sz w:val="18"/>
           <w:szCs w:val="18"/>
+          <w:lang w:val="en-US"/>
         </w:rPr>
         <w:t>_</w:t>
       </w:r>
@@ -19093,12 +19078,14 @@
         </w:rPr>
         <w:t>initials</w:t>
       </w:r>
+      <w:proofErr w:type="spellEnd"/>
       <w:r>
         <w:rPr>
           <w:rFonts w:ascii="Times New Roman" w:hAnsi="Times New Roman" w:cs="Times New Roman"/>
           <w:bCs/>
           <w:sz w:val="18"/>
           <w:szCs w:val="18"/>
+          <w:lang w:val="en-US"/>
         </w:rPr>
         <w:t>}}</w:t>
       </w:r>
@@ -19107,6 +19094,7 @@
           <w:rFonts w:ascii="Times New Roman" w:hAnsi="Times New Roman" w:cs="Times New Roman"/>
           <w:sz w:val="18"/>
           <w:szCs w:val="18"/>
+          <w:lang w:val="en-US"/>
         </w:rPr>
         <w:t>/</w:t>
       </w:r>
@@ -19116,6 +19104,7 @@
           <w:bCs/>
           <w:sz w:val="18"/>
           <w:szCs w:val="18"/>
+          <w:lang w:val="en-US"/>
         </w:rPr>
         <w:t xml:space="preserve"> </w:t>
       </w:r>
@@ -19142,8 +19131,9 @@
           <w:bCs/>
           <w:sz w:val="18"/>
           <w:szCs w:val="18"/>
-        </w:rPr>
-        <w:t xml:space="preserve">                                                                     </w:t>
+          <w:lang w:val="en-US"/>
+        </w:rPr>
+        <w:t xml:space="preserve">                                                                        </w:t>
       </w:r>
       <w:r>
         <w:rPr>
@@ -19152,7 +19142,7 @@
           <w:sz w:val="18"/>
           <w:szCs w:val="18"/>
         </w:rPr>
-        <w:t xml:space="preserve">   М.П. </w:t>
+        <w:t>М</w:t>
       </w:r>
       <w:r>
         <w:rPr>
@@ -19160,10 +19150,10 @@
           <w:bCs/>
           <w:sz w:val="18"/>
           <w:szCs w:val="18"/>
-        </w:rPr>
-        <w:t xml:space="preserve">{% </w:t>
-      </w:r>
-      <w:proofErr w:type="spellStart"/>
+          <w:lang w:val="en-US"/>
+        </w:rPr>
+        <w:t>.</w:t>
+      </w:r>
       <w:r>
         <w:rPr>
           <w:rFonts w:ascii="Times New Roman" w:hAnsi="Times New Roman" w:cs="Times New Roman"/>
@@ -19171,17 +19161,27 @@
           <w:sz w:val="18"/>
           <w:szCs w:val="18"/>
         </w:rPr>
-        <w:t>endif</w:t>
-      </w:r>
-      <w:proofErr w:type="spellEnd"/>
+        <w:t>П</w:t>
+      </w:r>
       <w:r>
         <w:rPr>
           <w:rFonts w:ascii="Times New Roman" w:hAnsi="Times New Roman" w:cs="Times New Roman"/>
           <w:bCs/>
           <w:sz w:val="18"/>
           <w:szCs w:val="18"/>
-        </w:rPr>
-        <w:t xml:space="preserve"> %}</w:t>
+          <w:lang w:val="en-US"/>
+        </w:rPr>
+        <w:t xml:space="preserve">. </w:t>
+      </w:r>
+      <w:r>
+        <w:rPr>
+          <w:rFonts w:ascii="Times New Roman" w:hAnsi="Times New Roman" w:cs="Times New Roman"/>
+          <w:bCs/>
+          <w:sz w:val="18"/>
+          <w:szCs w:val="18"/>
+          <w:lang w:val="en-US"/>
+        </w:rPr>
+        <w:t>{% endif %}</w:t>
       </w:r>
       <w:r>
         <w:rPr>
@@ -19208,6 +19208,7 @@
           <w:color w:val="000000"/>
           <w:sz w:val="18"/>
           <w:szCs w:val="18"/>
+          <w:lang w:val="en-US"/>
         </w:rPr>
       </w:pPr>
     </w:p>
@@ -19258,6 +19259,7 @@
                 <w:rFonts w:ascii="Times New Roman" w:hAnsi="Times New Roman" w:cs="Times New Roman"/>
                 <w:sz w:val="18"/>
                 <w:szCs w:val="18"/>
+                <w:lang w:val="en-US"/>
               </w:rPr>
               <w:br w:type="page"/>
             </w:r>
@@ -21062,6 +21064,7 @@
                 <w:bCs/>
                 <w:sz w:val="18"/>
                 <w:szCs w:val="18"/>
+                <w:lang w:val="en-US"/>
               </w:rPr>
             </w:pPr>
             <w:r>
@@ -21100,7 +21103,7 @@
                 <w:iCs/>
                 <w:sz w:val="18"/>
                 <w:szCs w:val="18"/>
-                <w:lang w:eastAsia="ru-RU"/>
+                <w:lang w:val="en-US" w:eastAsia="ru-RU"/>
               </w:rPr>
               <w:t xml:space="preserve">: </w:t>
             </w:r>
@@ -21110,29 +21113,31 @@
                 <w:iCs/>
                 <w:sz w:val="18"/>
                 <w:szCs w:val="18"/>
-                <w:lang w:eastAsia="ru-RU"/>
-              </w:rPr>
-              <w:t>Ген</w:t>
-            </w:r>
+                <w:lang w:val="en-US" w:eastAsia="ru-RU"/>
+              </w:rPr>
+              <w:t>{{</w:t>
+            </w:r>
+            <w:proofErr w:type="spellStart"/>
             <w:r>
               <w:rPr>
                 <w:rFonts w:ascii="Times New Roman" w:eastAsia="Times New Roman" w:hAnsi="Times New Roman" w:cs="Times New Roman"/>
                 <w:iCs/>
                 <w:sz w:val="18"/>
                 <w:szCs w:val="18"/>
-                <w:lang w:eastAsia="ru-RU"/>
-              </w:rPr>
-              <w:t xml:space="preserve">. </w:t>
-            </w:r>
+                <w:lang w:val="en-US" w:eastAsia="ru-RU"/>
+              </w:rPr>
+              <w:t>buyer_shorten_director_position</w:t>
+            </w:r>
+            <w:proofErr w:type="spellEnd"/>
             <w:r>
               <w:rPr>
                 <w:rFonts w:ascii="Times New Roman" w:eastAsia="Times New Roman" w:hAnsi="Times New Roman" w:cs="Times New Roman"/>
                 <w:iCs/>
                 <w:sz w:val="18"/>
                 <w:szCs w:val="18"/>
-                <w:lang w:eastAsia="ru-RU"/>
-              </w:rPr>
-              <w:t>Директор</w:t>
+                <w:lang w:val="en-US" w:eastAsia="ru-RU"/>
+              </w:rPr>
+              <w:t>}}</w:t>
             </w:r>
             <w:r>
               <w:rPr>
@@ -21140,7 +21145,7 @@
                 <w:iCs/>
                 <w:sz w:val="18"/>
                 <w:szCs w:val="18"/>
-                <w:lang w:eastAsia="ru-RU"/>
+                <w:lang w:val="en-US" w:eastAsia="ru-RU"/>
               </w:rPr>
               <w:t xml:space="preserve"> </w:t>
             </w:r>
@@ -21149,6 +21154,7 @@
                 <w:rFonts w:ascii="Times New Roman" w:hAnsi="Times New Roman" w:cs="Times New Roman"/>
                 <w:sz w:val="18"/>
                 <w:szCs w:val="18"/>
+                <w:lang w:val="en-US"/>
               </w:rPr>
               <w:t>____________________/</w:t>
             </w:r>
@@ -21158,9 +21164,11 @@
                 <w:bCs/>
                 <w:sz w:val="18"/>
                 <w:szCs w:val="18"/>
+                <w:lang w:val="en-US"/>
               </w:rPr>
               <w:t>{{</w:t>
             </w:r>
+            <w:proofErr w:type="spellStart"/>
             <w:r>
               <w:rPr>
                 <w:rFonts w:ascii="Times New Roman" w:hAnsi="Times New Roman" w:cs="Times New Roman"/>
@@ -21177,6 +21185,7 @@
                 <w:bCs/>
                 <w:sz w:val="18"/>
                 <w:szCs w:val="18"/>
+                <w:lang w:val="en-US"/>
               </w:rPr>
               <w:t>_</w:t>
             </w:r>
@@ -21190,12 +21199,14 @@
               </w:rPr>
               <w:t>initials</w:t>
             </w:r>
-            <w:r>
-              <w:rPr>
-                <w:rFonts w:ascii="Times New Roman" w:hAnsi="Times New Roman" w:cs="Times New Roman"/>
-                <w:bCs/>
-                <w:sz w:val="18"/>
-                <w:szCs w:val="18"/>
+            <w:proofErr w:type="spellEnd"/>
+            <w:r>
+              <w:rPr>
+                <w:rFonts w:ascii="Times New Roman" w:hAnsi="Times New Roman" w:cs="Times New Roman"/>
+                <w:bCs/>
+                <w:sz w:val="18"/>
+                <w:szCs w:val="18"/>
+                <w:lang w:val="en-US"/>
               </w:rPr>
               <w:t>}}</w:t>
             </w:r>
@@ -21204,6 +21215,7 @@
                 <w:rFonts w:ascii="Times New Roman" w:hAnsi="Times New Roman" w:cs="Times New Roman"/>
                 <w:sz w:val="18"/>
                 <w:szCs w:val="18"/>
+                <w:lang w:val="en-US"/>
               </w:rPr>
               <w:t>/</w:t>
             </w:r>
@@ -21213,6 +21225,7 @@
                 <w:bCs/>
                 <w:sz w:val="18"/>
                 <w:szCs w:val="18"/>
+                <w:lang w:val="en-US"/>
               </w:rPr>
               <w:t xml:space="preserve"> </w:t>
             </w:r>
@@ -21240,17 +21253,18 @@
                 <w:bCs/>
                 <w:sz w:val="18"/>
                 <w:szCs w:val="18"/>
-              </w:rPr>
-              <w:t xml:space="preserve">                                                                </w:t>
-            </w:r>
-            <w:r>
-              <w:rPr>
-                <w:rFonts w:ascii="Times New Roman" w:hAnsi="Times New Roman" w:cs="Times New Roman"/>
-                <w:bCs/>
-                <w:sz w:val="18"/>
-                <w:szCs w:val="18"/>
-              </w:rPr>
-              <w:t xml:space="preserve"> М.П. </w:t>
+                <w:lang w:val="en-US"/>
+              </w:rPr>
+              <w:t xml:space="preserve">                                                                 </w:t>
+            </w:r>
+            <w:r>
+              <w:rPr>
+                <w:rFonts w:ascii="Times New Roman" w:hAnsi="Times New Roman" w:cs="Times New Roman"/>
+                <w:bCs/>
+                <w:sz w:val="18"/>
+                <w:szCs w:val="18"/>
+              </w:rPr>
+              <w:t xml:space="preserve">М.П. </w:t>
             </w:r>
             <w:r>
               <w:rPr>

</xml_diff>

<commit_message>
Fixed numeration in comissions doc
</commit_message>
<xml_diff>
--- a/documents/templates/1_comissions(Договор поручения).docx
+++ b/documents/templates/1_comissions(Договор поручения).docx
@@ -3148,95 +3148,6 @@
                 </w:p>
               </w:tc>
             </w:tr>
-            <w:tr>
-              <w:trPr>
-                <w:trHeight w:val="227"/>
-              </w:trPr>
-              <w:tc>
-                <w:tcPr>
-                  <w:tcW w:w="3753" w:type="dxa"/>
-                  <w:tcBorders>
-                    <w:top w:val="single" w:sz="4" w:space="0" w:color="auto"/>
-                    <w:left w:val="single" w:sz="4" w:space="0" w:color="auto"/>
-                    <w:bottom w:val="single" w:sz="4" w:space="0" w:color="auto"/>
-                    <w:right w:val="single" w:sz="4" w:space="0" w:color="auto"/>
-                  </w:tcBorders>
-                  <w:shd w:val="clear" w:color="auto" w:fill="FFFFFF"/>
-                  <w:vAlign w:val="center"/>
-                </w:tcPr>
-                <w:p>
-                  <w:pPr>
-                    <w:autoSpaceDE w:val="0"/>
-                    <w:autoSpaceDN w:val="0"/>
-                    <w:adjustRightInd w:val="0"/>
-                    <w:spacing w:after="0" w:line="240" w:lineRule="auto"/>
-                    <w:rPr>
-                      <w:rFonts w:ascii="Times New Roman" w:hAnsi="Times New Roman" w:cs="Times New Roman"/>
-                      <w:sz w:val="18"/>
-                      <w:szCs w:val="18"/>
-                    </w:rPr>
-                  </w:pPr>
-                  <w:r>
-                    <w:rPr>
-                      <w:rFonts w:ascii="Times New Roman" w:hAnsi="Times New Roman" w:cs="Times New Roman"/>
-                      <w:sz w:val="18"/>
-                      <w:szCs w:val="18"/>
-                    </w:rPr>
-                    <w:t>Комплектация</w:t>
-                  </w:r>
-                </w:p>
-              </w:tc>
-              <w:tc>
-                <w:tcPr>
-                  <w:tcW w:w="6703" w:type="dxa"/>
-                  <w:tcBorders>
-                    <w:top w:val="single" w:sz="4" w:space="0" w:color="auto"/>
-                    <w:left w:val="single" w:sz="4" w:space="0" w:color="auto"/>
-                    <w:bottom w:val="single" w:sz="4" w:space="0" w:color="auto"/>
-                    <w:right w:val="single" w:sz="4" w:space="0" w:color="auto"/>
-                  </w:tcBorders>
-                  <w:shd w:val="clear" w:color="auto" w:fill="FFFFFF"/>
-                </w:tcPr>
-                <w:p>
-                  <w:pPr>
-                    <w:autoSpaceDE w:val="0"/>
-                    <w:autoSpaceDN w:val="0"/>
-                    <w:adjustRightInd w:val="0"/>
-                    <w:spacing w:after="0" w:line="240" w:lineRule="auto"/>
-                    <w:rPr>
-                      <w:rFonts w:ascii="Times New Roman" w:hAnsi="Times New Roman" w:cs="Times New Roman"/>
-                      <w:sz w:val="18"/>
-                      <w:szCs w:val="18"/>
-                    </w:rPr>
-                  </w:pPr>
-                  <w:r>
-                    <w:rPr>
-                      <w:rFonts w:ascii="Times New Roman" w:hAnsi="Times New Roman" w:cs="Times New Roman"/>
-                      <w:sz w:val="18"/>
-                      <w:szCs w:val="18"/>
-                    </w:rPr>
-                    <w:t>{{</w:t>
-                  </w:r>
-                  <w:r>
-                    <w:rPr>
-                      <w:rFonts w:ascii="Times New Roman" w:hAnsi="Times New Roman" w:cs="Times New Roman"/>
-                      <w:sz w:val="18"/>
-                      <w:szCs w:val="18"/>
-                      <w:lang w:val="en-US"/>
-                    </w:rPr>
-                    <w:t>equipment</w:t>
-                  </w:r>
-                  <w:r>
-                    <w:rPr>
-                      <w:rFonts w:ascii="Times New Roman" w:hAnsi="Times New Roman" w:cs="Times New Roman"/>
-                      <w:sz w:val="18"/>
-                      <w:szCs w:val="18"/>
-                    </w:rPr>
-                    <w:t>}}</w:t>
-                  </w:r>
-                </w:p>
-              </w:tc>
-            </w:tr>
           </w:tbl>
           <w:p>
             <w:pPr>
@@ -4368,7 +4279,6 @@
                 <w:szCs w:val="18"/>
                 <w:lang w:eastAsia="ru-RU"/>
               </w:rPr>
-              <w:lastRenderedPageBreak/>
               <w:t xml:space="preserve">4. Расчеты Сторон </w:t>
             </w:r>
           </w:p>
@@ -4420,6 +4330,7 @@
                 <w:szCs w:val="18"/>
                 <w:lang w:eastAsia="ru-RU"/>
               </w:rPr>
+              <w:lastRenderedPageBreak/>
               <w:t xml:space="preserve">4.1. Поверенный обязуется в течение 2 (двух) банковских дней со дня постановки покупателем ТС на учет в ГИБДД, но не ранее 10 (десяти) банковских дней с даты получения Поверенным от покупателя денежных средств в оплату ТС и подписания между Поверенным и покупателем Акта приема-передачи ТС перечислить Доверителю денежные средства в размере цены реализации ТС, указанной в п. 2.1.2. Договора за вычетом причитающегося Поверенному вознаграждения и расходов, связанных с выполнением поручения. </w:t>
             </w:r>
             <w:r>
@@ -4745,9 +4656,20 @@
                 <w:bCs/>
                 <w:sz w:val="18"/>
                 <w:szCs w:val="18"/>
-                <w:lang w:eastAsia="ru-RU"/>
-              </w:rPr>
-              <w:t xml:space="preserve">6. Срок действия Договора </w:t>
+                <w:lang w:val="en-US" w:eastAsia="ru-RU"/>
+              </w:rPr>
+              <w:t>5</w:t>
+            </w:r>
+            <w:r>
+              <w:rPr>
+                <w:rFonts w:ascii="Times New Roman" w:eastAsia="Times New Roman" w:hAnsi="Times New Roman" w:cs="Times New Roman"/>
+                <w:b/>
+                <w:bCs/>
+                <w:sz w:val="18"/>
+                <w:szCs w:val="18"/>
+                <w:lang w:eastAsia="ru-RU"/>
+              </w:rPr>
+              <w:t xml:space="preserve">. Срок действия Договора </w:t>
             </w:r>
           </w:p>
         </w:tc>
@@ -4798,7 +4720,16 @@
                 <w:szCs w:val="18"/>
                 <w:lang w:eastAsia="ru-RU"/>
               </w:rPr>
-              <w:t xml:space="preserve">6.1. Договор вступает в силу с момента его подписания Сторонами и действует в течение 90 (Девяносто) календарных дней. По истечении данного срока Договор перезаключается на новых условиях или считается расторгнутым по причине отмены поручения. </w:t>
+              <w:t>5</w:t>
+            </w:r>
+            <w:r>
+              <w:rPr>
+                <w:rFonts w:ascii="Times New Roman" w:eastAsia="Times New Roman" w:hAnsi="Times New Roman" w:cs="Times New Roman"/>
+                <w:sz w:val="18"/>
+                <w:szCs w:val="18"/>
+                <w:lang w:eastAsia="ru-RU"/>
+              </w:rPr>
+              <w:t xml:space="preserve">.1. Договор вступает в силу с момента его подписания Сторонами и действует в течение 90 (Девяносто) календарных дней. По истечении данного срока Договор перезаключается на новых условиях или считается расторгнутым по причине отмены поручения. </w:t>
             </w:r>
           </w:p>
           <w:p>
@@ -4820,7 +4751,16 @@
                 <w:szCs w:val="18"/>
                 <w:lang w:eastAsia="ru-RU"/>
               </w:rPr>
-              <w:t>6.2</w:t>
+              <w:t>5</w:t>
+            </w:r>
+            <w:r>
+              <w:rPr>
+                <w:rFonts w:ascii="Times New Roman" w:eastAsia="Times New Roman" w:hAnsi="Times New Roman" w:cs="Times New Roman"/>
+                <w:sz w:val="18"/>
+                <w:szCs w:val="18"/>
+                <w:lang w:eastAsia="ru-RU"/>
+              </w:rPr>
+              <w:t>.2</w:t>
             </w:r>
             <w:r>
               <w:rPr>
@@ -4851,7 +4791,16 @@
                 <w:szCs w:val="18"/>
                 <w:lang w:eastAsia="ru-RU"/>
               </w:rPr>
-              <w:t>6.3. Договор может быть расторгнут в любое время по соглашению Сторон, либо по иным основаниям, предусмотренным Договором и действующим законодательством РФ.</w:t>
+              <w:t>5</w:t>
+            </w:r>
+            <w:r>
+              <w:rPr>
+                <w:rFonts w:ascii="Times New Roman" w:eastAsia="Times New Roman" w:hAnsi="Times New Roman" w:cs="Times New Roman"/>
+                <w:sz w:val="18"/>
+                <w:szCs w:val="18"/>
+                <w:lang w:eastAsia="ru-RU"/>
+              </w:rPr>
+              <w:t>.3. Договор может быть расторгнут в любое время по соглашению Сторон, либо по иным основаниям, предусмотренным Договором и действующим законодательством РФ.</w:t>
             </w:r>
           </w:p>
         </w:tc>
@@ -4900,9 +4849,20 @@
                 <w:bCs/>
                 <w:sz w:val="18"/>
                 <w:szCs w:val="18"/>
-                <w:lang w:eastAsia="ru-RU"/>
-              </w:rPr>
-              <w:t xml:space="preserve">7. Прочие условия </w:t>
+                <w:lang w:val="en-US" w:eastAsia="ru-RU"/>
+              </w:rPr>
+              <w:t>6</w:t>
+            </w:r>
+            <w:r>
+              <w:rPr>
+                <w:rFonts w:ascii="Times New Roman" w:eastAsia="Times New Roman" w:hAnsi="Times New Roman" w:cs="Times New Roman"/>
+                <w:b/>
+                <w:bCs/>
+                <w:sz w:val="18"/>
+                <w:szCs w:val="18"/>
+                <w:lang w:eastAsia="ru-RU"/>
+              </w:rPr>
+              <w:t xml:space="preserve">. Прочие условия </w:t>
             </w:r>
           </w:p>
         </w:tc>
@@ -4953,7 +4913,16 @@
                 <w:szCs w:val="18"/>
                 <w:lang w:eastAsia="ru-RU"/>
               </w:rPr>
-              <w:t>7.1. В случае возникновения обстоятельств непреодолимой силы, препятствующих исполнению обязательств, сроки исполнения продлеваются соразмерно времени действия таких обстоятельств, а стороны освобождаются от ответственности за просрочку. При возникновении таких обстоятельств каждая из Сторон обязана без промедления известить о них в письменном виде другую Сторону.</w:t>
+              <w:t>6</w:t>
+            </w:r>
+            <w:r>
+              <w:rPr>
+                <w:rFonts w:ascii="Times New Roman" w:eastAsia="Times New Roman" w:hAnsi="Times New Roman" w:cs="Times New Roman"/>
+                <w:sz w:val="18"/>
+                <w:szCs w:val="18"/>
+                <w:lang w:eastAsia="ru-RU"/>
+              </w:rPr>
+              <w:t>.1. В случае возникновения обстоятельств непреодолимой силы, препятствующих исполнению обязательств, сроки исполнения продлеваются соразмерно времени действия таких обстоятельств, а стороны освобождаются от ответственности за просрочку. При возникновении таких обстоятельств каждая из Сторон обязана без промедления известить о них в письменном виде другую Сторону.</w:t>
             </w:r>
           </w:p>
           <w:p>
@@ -4975,7 +4944,16 @@
                 <w:szCs w:val="18"/>
                 <w:lang w:eastAsia="ru-RU"/>
               </w:rPr>
-              <w:t>7.2. Все споры и разногласия, которые могут возникнуть при исполнении условий Договора, Стороны будут стремиться разрешить путем переговоров. Споры, не урегулированные путем переговоров, разрешаются в судебном порядке, установленном действующим законодательством Российской Федерации.</w:t>
+              <w:t>6</w:t>
+            </w:r>
+            <w:r>
+              <w:rPr>
+                <w:rFonts w:ascii="Times New Roman" w:eastAsia="Times New Roman" w:hAnsi="Times New Roman" w:cs="Times New Roman"/>
+                <w:sz w:val="18"/>
+                <w:szCs w:val="18"/>
+                <w:lang w:eastAsia="ru-RU"/>
+              </w:rPr>
+              <w:t>.2. Все споры и разногласия, которые могут возникнуть при исполнении условий Договора, Стороны будут стремиться разрешить путем переговоров. Споры, не урегулированные путем переговоров, разрешаются в судебном порядке, установленном действующим законодательством Российской Федерации.</w:t>
             </w:r>
           </w:p>
           <w:p>
@@ -4997,7 +4975,16 @@
                 <w:szCs w:val="18"/>
                 <w:lang w:eastAsia="ru-RU"/>
               </w:rPr>
-              <w:t>7.3. Стороны договорились, что обмен информацией и документами может осуществляться на указанный в Договоре номер сотового телефона / адрес электронной почты / почтовый адрес / информационно-коммуникационные сервисы / мессенджеры / по ЭДО.</w:t>
+              <w:t>6</w:t>
+            </w:r>
+            <w:r>
+              <w:rPr>
+                <w:rFonts w:ascii="Times New Roman" w:eastAsia="Times New Roman" w:hAnsi="Times New Roman" w:cs="Times New Roman"/>
+                <w:sz w:val="18"/>
+                <w:szCs w:val="18"/>
+                <w:lang w:eastAsia="ru-RU"/>
+              </w:rPr>
+              <w:t>.3. Стороны договорились, что обмен информацией и документами может осуществляться на указанный в Договоре номер сотового телефона / адрес электронной почты / почтовый адрес / информационно-коммуникационные сервисы / мессенджеры / по ЭДО.</w:t>
             </w:r>
           </w:p>
           <w:p>
@@ -5019,7 +5006,16 @@
                 <w:szCs w:val="18"/>
                 <w:lang w:eastAsia="ru-RU"/>
               </w:rPr>
-              <w:t>7.4. Стороны признают юридическую силу документов (договор, акт, дополнительное соглашение), подписанных с использованием факсимильного воспроизведения подписи уполномоченных лиц.</w:t>
+              <w:t>6</w:t>
+            </w:r>
+            <w:r>
+              <w:rPr>
+                <w:rFonts w:ascii="Times New Roman" w:eastAsia="Times New Roman" w:hAnsi="Times New Roman" w:cs="Times New Roman"/>
+                <w:sz w:val="18"/>
+                <w:szCs w:val="18"/>
+                <w:lang w:eastAsia="ru-RU"/>
+              </w:rPr>
+              <w:t>.4. Стороны признают юридическую силу документов (договор, акт, дополнительное соглашение), подписанных с использованием факсимильного воспроизведения подписи уполномоченных лиц.</w:t>
             </w:r>
           </w:p>
           <w:p>
@@ -5041,7 +5037,16 @@
                 <w:szCs w:val="18"/>
                 <w:lang w:eastAsia="ru-RU"/>
               </w:rPr>
-              <w:t>7.5. Договор заключен в трёх экземплярах, имеющих равную юридическую силу, по одному для каждой из Сторон, и один новому покупателю с целью предоставления в ГИБДД.</w:t>
+              <w:t>6</w:t>
+            </w:r>
+            <w:r>
+              <w:rPr>
+                <w:rFonts w:ascii="Times New Roman" w:eastAsia="Times New Roman" w:hAnsi="Times New Roman" w:cs="Times New Roman"/>
+                <w:sz w:val="18"/>
+                <w:szCs w:val="18"/>
+                <w:lang w:eastAsia="ru-RU"/>
+              </w:rPr>
+              <w:t>.5. Договор заключен в трёх экземплярах, имеющих равную юридическую силу, по одному для каждой из Сторон, и один новому покупателю с целью предоставления в ГИБДД.</w:t>
             </w:r>
           </w:p>
         </w:tc>
@@ -5092,7 +5097,18 @@
                 <w:szCs w:val="18"/>
                 <w:lang w:eastAsia="ru-RU"/>
               </w:rPr>
-              <w:t>8. Реквизиты</w:t>
+              <w:t>7</w:t>
+            </w:r>
+            <w:r>
+              <w:rPr>
+                <w:rFonts w:ascii="Times New Roman" w:eastAsia="Times New Roman" w:hAnsi="Times New Roman" w:cs="Times New Roman"/>
+                <w:b/>
+                <w:bCs/>
+                <w:sz w:val="18"/>
+                <w:szCs w:val="18"/>
+                <w:lang w:eastAsia="ru-RU"/>
+              </w:rPr>
+              <w:t>. Реквизиты</w:t>
             </w:r>
             <w:r>
               <w:rPr>
@@ -10821,96 +10837,6 @@
           </w:p>
         </w:tc>
       </w:tr>
-      <w:tr>
-        <w:trPr>
-          <w:trHeight w:val="227"/>
-        </w:trPr>
-        <w:tc>
-          <w:tcPr>
-            <w:tcW w:w="3753" w:type="dxa"/>
-            <w:tcBorders>
-              <w:top w:val="single" w:sz="4" w:space="0" w:color="auto"/>
-              <w:left w:val="single" w:sz="4" w:space="0" w:color="auto"/>
-              <w:bottom w:val="single" w:sz="4" w:space="0" w:color="auto"/>
-              <w:right w:val="single" w:sz="4" w:space="0" w:color="auto"/>
-            </w:tcBorders>
-            <w:shd w:val="clear" w:color="auto" w:fill="FFFFFF"/>
-            <w:vAlign w:val="center"/>
-            <w:hideMark/>
-          </w:tcPr>
-          <w:p>
-            <w:pPr>
-              <w:autoSpaceDE w:val="0"/>
-              <w:autoSpaceDN w:val="0"/>
-              <w:adjustRightInd w:val="0"/>
-              <w:spacing w:after="0" w:line="240" w:lineRule="auto"/>
-              <w:rPr>
-                <w:rFonts w:ascii="Times New Roman" w:hAnsi="Times New Roman" w:cs="Times New Roman"/>
-                <w:sz w:val="18"/>
-                <w:szCs w:val="18"/>
-              </w:rPr>
-            </w:pPr>
-            <w:r>
-              <w:rPr>
-                <w:rFonts w:ascii="Times New Roman" w:hAnsi="Times New Roman" w:cs="Times New Roman"/>
-                <w:sz w:val="18"/>
-                <w:szCs w:val="18"/>
-              </w:rPr>
-              <w:t>Комплектация</w:t>
-            </w:r>
-          </w:p>
-        </w:tc>
-        <w:tc>
-          <w:tcPr>
-            <w:tcW w:w="6702" w:type="dxa"/>
-            <w:tcBorders>
-              <w:top w:val="single" w:sz="4" w:space="0" w:color="auto"/>
-              <w:left w:val="single" w:sz="4" w:space="0" w:color="auto"/>
-              <w:bottom w:val="single" w:sz="4" w:space="0" w:color="auto"/>
-              <w:right w:val="single" w:sz="4" w:space="0" w:color="auto"/>
-            </w:tcBorders>
-            <w:shd w:val="clear" w:color="auto" w:fill="FFFFFF"/>
-          </w:tcPr>
-          <w:p>
-            <w:pPr>
-              <w:autoSpaceDE w:val="0"/>
-              <w:autoSpaceDN w:val="0"/>
-              <w:adjustRightInd w:val="0"/>
-              <w:spacing w:after="0" w:line="240" w:lineRule="auto"/>
-              <w:rPr>
-                <w:rFonts w:ascii="Times New Roman" w:hAnsi="Times New Roman" w:cs="Times New Roman"/>
-                <w:sz w:val="18"/>
-                <w:szCs w:val="18"/>
-              </w:rPr>
-            </w:pPr>
-            <w:r>
-              <w:rPr>
-                <w:rFonts w:ascii="Times New Roman" w:hAnsi="Times New Roman" w:cs="Times New Roman"/>
-                <w:sz w:val="18"/>
-                <w:szCs w:val="18"/>
-              </w:rPr>
-              <w:t>{{</w:t>
-            </w:r>
-            <w:r>
-              <w:rPr>
-                <w:rFonts w:ascii="Times New Roman" w:hAnsi="Times New Roman" w:cs="Times New Roman"/>
-                <w:sz w:val="18"/>
-                <w:szCs w:val="18"/>
-                <w:lang w:val="en-US"/>
-              </w:rPr>
-              <w:t>equipment</w:t>
-            </w:r>
-            <w:r>
-              <w:rPr>
-                <w:rFonts w:ascii="Times New Roman" w:hAnsi="Times New Roman" w:cs="Times New Roman"/>
-                <w:sz w:val="18"/>
-                <w:szCs w:val="18"/>
-              </w:rPr>
-              <w:t>}}</w:t>
-            </w:r>
-          </w:p>
-        </w:tc>
-      </w:tr>
     </w:tbl>
     <w:p>
       <w:pPr>
@@ -18253,96 +18179,6 @@
           </w:p>
         </w:tc>
       </w:tr>
-      <w:tr>
-        <w:trPr>
-          <w:trHeight w:val="227"/>
-        </w:trPr>
-        <w:tc>
-          <w:tcPr>
-            <w:tcW w:w="3753" w:type="dxa"/>
-            <w:tcBorders>
-              <w:top w:val="single" w:sz="4" w:space="0" w:color="auto"/>
-              <w:left w:val="single" w:sz="4" w:space="0" w:color="auto"/>
-              <w:bottom w:val="single" w:sz="4" w:space="0" w:color="auto"/>
-              <w:right w:val="single" w:sz="4" w:space="0" w:color="auto"/>
-            </w:tcBorders>
-            <w:shd w:val="clear" w:color="auto" w:fill="FFFFFF"/>
-            <w:vAlign w:val="center"/>
-            <w:hideMark/>
-          </w:tcPr>
-          <w:p>
-            <w:pPr>
-              <w:autoSpaceDE w:val="0"/>
-              <w:autoSpaceDN w:val="0"/>
-              <w:adjustRightInd w:val="0"/>
-              <w:spacing w:after="0" w:line="240" w:lineRule="auto"/>
-              <w:rPr>
-                <w:rFonts w:ascii="Times New Roman" w:hAnsi="Times New Roman" w:cs="Times New Roman"/>
-                <w:sz w:val="18"/>
-                <w:szCs w:val="18"/>
-              </w:rPr>
-            </w:pPr>
-            <w:r>
-              <w:rPr>
-                <w:rFonts w:ascii="Times New Roman" w:hAnsi="Times New Roman" w:cs="Times New Roman"/>
-                <w:sz w:val="18"/>
-                <w:szCs w:val="18"/>
-              </w:rPr>
-              <w:t>Комплектация</w:t>
-            </w:r>
-          </w:p>
-        </w:tc>
-        <w:tc>
-          <w:tcPr>
-            <w:tcW w:w="6702" w:type="dxa"/>
-            <w:tcBorders>
-              <w:top w:val="single" w:sz="4" w:space="0" w:color="auto"/>
-              <w:left w:val="single" w:sz="4" w:space="0" w:color="auto"/>
-              <w:bottom w:val="single" w:sz="4" w:space="0" w:color="auto"/>
-              <w:right w:val="single" w:sz="4" w:space="0" w:color="auto"/>
-            </w:tcBorders>
-            <w:shd w:val="clear" w:color="auto" w:fill="FFFFFF"/>
-          </w:tcPr>
-          <w:p>
-            <w:pPr>
-              <w:autoSpaceDE w:val="0"/>
-              <w:autoSpaceDN w:val="0"/>
-              <w:adjustRightInd w:val="0"/>
-              <w:spacing w:after="0" w:line="240" w:lineRule="auto"/>
-              <w:rPr>
-                <w:rFonts w:ascii="Times New Roman" w:hAnsi="Times New Roman" w:cs="Times New Roman"/>
-                <w:sz w:val="18"/>
-                <w:szCs w:val="18"/>
-              </w:rPr>
-            </w:pPr>
-            <w:r>
-              <w:rPr>
-                <w:rFonts w:ascii="Times New Roman" w:hAnsi="Times New Roman" w:cs="Times New Roman"/>
-                <w:sz w:val="18"/>
-                <w:szCs w:val="18"/>
-              </w:rPr>
-              <w:t>{{</w:t>
-            </w:r>
-            <w:r>
-              <w:rPr>
-                <w:rFonts w:ascii="Times New Roman" w:hAnsi="Times New Roman" w:cs="Times New Roman"/>
-                <w:sz w:val="18"/>
-                <w:szCs w:val="18"/>
-                <w:lang w:val="en-US"/>
-              </w:rPr>
-              <w:t>equipment</w:t>
-            </w:r>
-            <w:r>
-              <w:rPr>
-                <w:rFonts w:ascii="Times New Roman" w:hAnsi="Times New Roman" w:cs="Times New Roman"/>
-                <w:sz w:val="18"/>
-                <w:szCs w:val="18"/>
-              </w:rPr>
-              <w:t>}}</w:t>
-            </w:r>
-          </w:p>
-        </w:tc>
-      </w:tr>
     </w:tbl>
     <w:p>
       <w:pPr>
@@ -19259,7 +19095,6 @@
                 <w:rFonts w:ascii="Times New Roman" w:hAnsi="Times New Roman" w:cs="Times New Roman"/>
                 <w:sz w:val="18"/>
                 <w:szCs w:val="18"/>
-                <w:lang w:val="en-US"/>
               </w:rPr>
               <w:br w:type="page"/>
             </w:r>
@@ -22327,6 +22162,7 @@
   <w:style w:type="character" w:default="1" w:styleId="a0">
     <w:name w:val="Default Paragraph Font"/>
     <w:uiPriority w:val="1"/>
+    <w:semiHidden/>
     <w:unhideWhenUsed/>
   </w:style>
   <w:style w:type="table" w:default="1" w:styleId="a1">

</xml_diff>